<commit_message>
docs(methods): reorder methods sections strictly aligned with figures (Fig 1b to Fig 6)
</commit_message>
<xml_diff>
--- a/final_figures_acceptance_20260906/05_Statistical_Tables_and_Audits/manuscript_methods_mouse_spaceflight_transcriptome.docx
+++ b/final_figures_acceptance_20260906/05_Statistical_Tables_and_Audits/manuscript_methods_mouse_spaceflight_transcriptome.docx
@@ -46,10 +46,10 @@
             <w:tcW w:type="dxa" w:w="9360"/>
             <w:shd w:fill="F2F5F9"/>
             <w:tcMar>
-              <w:top w:w="140" w:type="dxa"/>
-              <w:bottom w:w="140" w:type="dxa"/>
-              <w:left w:w="200" w:type="dxa"/>
-              <w:right w:w="200" w:type="dxa"/>
+              <w:top w:w="130" w:type="dxa"/>
+              <w:bottom w:w="130" w:type="dxa"/>
+              <w:left w:w="180" w:type="dxa"/>
+              <w:right w:w="180" w:type="dxa"/>
             </w:tcMar>
             <w:tcBorders>
               <w:left w:val="single" w:sz="24" w:space="0" w:color="1F4E78"/>
@@ -69,7 +69,7 @@
                 <w:color w:val="1F4E78"/>
                 <w:sz w:val="19"/>
               </w:rPr>
-              <w:t>[GOVERNANCE &amp; REPRODUCIBILITY CONTRACT]</w:t>
+              <w:t>[FIGURE-ALIGNED METHODS SPECIFICATION]</w:t>
               <w:br/>
             </w:r>
             <w:r>
@@ -77,9 +77,9 @@
                 <w:rFonts w:ascii="Calibri" w:hAnsi="Calibri"/>
                 <w:i/>
                 <w:color w:val="333333"/>
-                <w:sz w:val="20"/>
+                <w:sz w:val="19"/>
               </w:rPr>
-              <w:t>This Methods document is compiled with strict fidelity to the audited publication analysis pipeline, frozen multi-omics matrices, and production figures (Main Figures 1b–6, Supplementary Figures S1–S6, and the 7-pathway linear boxplots). Analytical governance enforces immutable Ensembl Gene IDs (GRCm38/GRCm39) as computational keys, R/Python reproducibility, and deterministic random seed locking at seed = 25.</w:t>
+              <w:t>Organization &amp; Rigor Contract: This Methods section is structured strictly in the sequential order of publication figures (Figure 1b to Figure 6, Supplementary Figures S1 to S6, and statistical audit tables). The text faithfully mirrors the actual computational implementation in the verified repository code, including the formal renumbering of DNA repair linear boxplots into Fig. 4b–d (DSB pathways: NHEJ, HR, A-EJ) and Fig. 5b–e (SSB pathways: BER, NER, MMR, FA), followed by the respective meta-dotplots (Fig. 4e and Fig. 5f). All analyses adhere to immutable Ensembl Gene IDs (GRCm38/GRCm39) as computational primary keys and deterministic pseudo-random seed locking at seed = 25.</w:t>
             </w:r>
           </w:p>
         </w:tc>
@@ -87,7 +87,7 @@
     </w:tbl>
     <w:p>
       <w:pPr>
-        <w:spacing w:before="0" w:after="80"/>
+        <w:spacing w:before="0" w:after="60"/>
       </w:pPr>
     </w:p>
     <w:p>
@@ -100,21 +100,21 @@
           <w:rFonts w:ascii="Arial" w:hAnsi="Arial"/>
           <w:b/>
           <w:color w:val="1F4E78"/>
-          <w:sz w:val="25"/>
+          <w:sz w:val="24"/>
         </w:rPr>
-        <w:t>1. Spaceflight Transcriptome Cohort Compilation and Metadata Curation</w:t>
+        <w:t>1. Experimental Design, Animal Cohort Compilation, and Multidimensional Metadata (Figure 1b, Figure 6)</w:t>
       </w:r>
     </w:p>
     <w:p>
       <w:pPr>
-        <w:spacing w:line="300" w:lineRule="auto" w:before="0" w:after="100"/>
+        <w:spacing w:line="293" w:lineRule="auto" w:before="0" w:after="90"/>
       </w:pPr>
       <w:r>
         <w:rPr>
           <w:rFonts w:ascii="Calibri" w:hAnsi="Calibri"/>
           <w:b/>
           <w:color w:val="262626"/>
-          <w:sz w:val="21"/>
+          <w:sz w:val="20"/>
         </w:rPr>
         <w:t xml:space="preserve">Cohort Scope and Biospecimen Selection: </w:t>
       </w:r>
@@ -122,21 +122,21 @@
         <w:rPr>
           <w:rFonts w:ascii="Calibri" w:hAnsi="Calibri"/>
           <w:color w:val="262626"/>
-          <w:sz w:val="21"/>
+          <w:sz w:val="20"/>
         </w:rPr>
-        <w:t>To establish an organism-wide, multi-tissue atlas of spaceflight-induced transcriptional adaptations and DNA damage repair alterations, transcriptomic profiles and experimental metadata were curated from the NASA Open Science Data Repository (OSDR, formerly GeneLab; https://osdr.nasa.gov/). The analytical cohort encompasses 48 independent transcriptomic accessions (OSD datasets) across 59 primary analysis units, comprising 761 murine RNA-seq biospecimens spanning 26 distinct anatomical tissues (Fig. 1b, Fig. 6).</w:t>
+        <w:t>To establish an organism-wide, multi-tissue atlas of transcriptional adaptations and DNA damage repair alterations under spaceflight environmental stressors, transcriptomic profiles and experimental metadata were curated from the NASA Open Science Data Repository (OSDR, formerly GeneLab; https://osdr.nasa.gov/). The analytical cohort encompasses 48 independent transcriptomic accessions (OSD datasets) across 59 primary analysis units, comprising 761 murine RNA-seq biospecimens spanning 26 distinct anatomical tissues (Figure 1b, Figure 6).</w:t>
       </w:r>
     </w:p>
     <w:p>
       <w:pPr>
-        <w:spacing w:line="300" w:lineRule="auto" w:before="0" w:after="100"/>
+        <w:spacing w:line="293" w:lineRule="auto" w:before="0" w:after="90"/>
       </w:pPr>
       <w:r>
         <w:rPr>
           <w:rFonts w:ascii="Calibri" w:hAnsi="Calibri"/>
           <w:b/>
           <w:color w:val="262626"/>
-          <w:sz w:val="21"/>
+          <w:sz w:val="20"/>
         </w:rPr>
         <w:t xml:space="preserve">Metadata Audit and Conflict Governance: </w:t>
       </w:r>
@@ -144,31 +144,31 @@
         <w:rPr>
           <w:rFonts w:ascii="Calibri" w:hAnsi="Calibri"/>
           <w:color w:val="262626"/>
-          <w:sz w:val="21"/>
+          <w:sz w:val="20"/>
         </w:rPr>
         <w:t>Biological and study metadata were programmatically extracted directly from the official NASA OSDR RESTful API and ISA-Tab archive ZIP files (R/data/01_refresh_osdr_mouse_metadata.R). The unified cohort includes 360 spaceflight mice (Flight / μG) and 401 ground-control mice (Ground control, Vivarium control, or Ground centrifuge / 1G baseline control). Exact donor animal identities (accession::Source Name), flight mission assignments across 13 mission clusters (SpaceX-4 to SpaceX-21, NG-11), biological sex (female and male), and donor chronological age (15 discrete age brackets, ranging from 8 to 32 weeks) were audited to resolve legacy ISA syntax discrepancies (such as confirming the current API mission assignment SpaceX-8 for OSD-162) without artificial age conversion or continuous imputation. Technical replicates were collapsed to ensure biological independence across all downstream tests.</w:t>
       </w:r>
     </w:p>
     <w:p>
       <w:pPr>
-        <w:spacing w:line="300" w:lineRule="auto" w:before="0" w:after="100"/>
+        <w:spacing w:line="293" w:lineRule="auto" w:before="0" w:after="90"/>
       </w:pPr>
       <w:r>
         <w:rPr>
           <w:rFonts w:ascii="Calibri" w:hAnsi="Calibri"/>
           <w:b/>
           <w:color w:val="262626"/>
-          <w:sz w:val="21"/>
+          <w:sz w:val="20"/>
         </w:rPr>
-        <w:t xml:space="preserve">Metadata Bubble Visualization: </w:t>
+        <w:t xml:space="preserve">Metadata Bubble Visualization and Complete Audit: </w:t>
       </w:r>
       <w:r>
         <w:rPr>
           <w:rFonts w:ascii="Calibri" w:hAnsi="Calibri"/>
           <w:color w:val="262626"/>
-          <w:sz w:val="21"/>
+          <w:sz w:val="20"/>
         </w:rPr>
-        <w:t>Experimental design and animal allocation across 26 tissues were visualized using a stratified bubble plot (Fig. 1b, Fig. 6). The horizontal axis follows the canonical cross-tissue DNA damage response (DDR) activation rank. Vertically, each mission cluster is bifurcated into paired female and male tracks, with point area scaling with unique donor mouse counts. Age brackets are mapped to a fixed chronological 15-color palette (yellow -&gt; green -&gt; blue -&gt; purple) without continuous interpolation.</w:t>
+        <w:t>Experimental design and animal allocation across 26 tissues were visualized using a stratified bubble plot (Figure 1b, Figure 6). The horizontal axis follows the canonical cross-tissue DNA damage response (DDR) activation rank. Vertically, each mission cluster is bifurcated into paired female and male tracks, with point area scaling with unique donor mouse counts. Age brackets are mapped to a fixed chronological 15-color palette (yellow -&gt; green -&gt; blue -&gt; purple) without continuous interpolation. The single-sample audit table Fig_6_mouse_sample_metadata_complete_audit.csv contains 761 rows and 54 audited attributes verifying complete sample-to-study traceability.</w:t>
       </w:r>
     </w:p>
     <w:p>
@@ -181,75 +181,75 @@
           <w:rFonts w:ascii="Arial" w:hAnsi="Arial"/>
           <w:b/>
           <w:color w:val="1F4E78"/>
-          <w:sz w:val="25"/>
+          <w:sz w:val="24"/>
         </w:rPr>
-        <w:t>2. Gene Annotation Governance and Stable Identifier Mapping</w:t>
+        <w:t>2. Functional Pathway Enrichment and Cross-Tissue Gene Ontology Profiling (Figure 1c, Supplementary Figure S1)</w:t>
       </w:r>
     </w:p>
     <w:p>
       <w:pPr>
-        <w:spacing w:line="300" w:lineRule="auto" w:before="0" w:after="100"/>
+        <w:spacing w:line="293" w:lineRule="auto" w:before="0" w:after="90"/>
       </w:pPr>
       <w:r>
         <w:rPr>
           <w:rFonts w:ascii="Calibri" w:hAnsi="Calibri"/>
           <w:b/>
           <w:color w:val="262626"/>
-          <w:sz w:val="21"/>
+          <w:sz w:val="20"/>
         </w:rPr>
-        <w:t xml:space="preserve">Immutable Identifier Governance: </w:t>
+        <w:t xml:space="preserve">Pre-Ranked fgsea Multilevel Modeling: </w:t>
       </w:r>
       <w:r>
         <w:rPr>
           <w:rFonts w:ascii="Calibri" w:hAnsi="Calibri"/>
           <w:color w:val="262626"/>
-          <w:sz w:val="21"/>
+          <w:sz w:val="20"/>
         </w:rPr>
-        <w:t>To eliminate gene symbol instability, historical alias drift, and erroneous cross-version joins, all computational analyses strictly adopted immutable Ensembl Gene Identifiers (Mus musculus Ensembl release GRCm38/GRCm39, ENSMUSG*) as primary keys. Official Mouse Genome Informatics (MGI) symbols and Entrez IDs were maintained strictly as display annotations in final visualization layers.</w:t>
+        <w:t>Functional pathway enrichment was evaluated via pre-ranked Gene Set Enrichment Analysis using fgseaMultilevel (fgsea package; R 4.4.3), with pseudo-random seeds locked at seed = 25. Differential expression was modeled within each accession using negative binomial GLMs in DESeq2, with contrast orientation audited to ensure Spaceflight vs. Ground directionality. Genes within each comparison were ranked by signed differential Wald statistics: S = sign(log2FC) · (-log10 P_nominal).</w:t>
       </w:r>
     </w:p>
     <w:p>
       <w:pPr>
-        <w:spacing w:line="300" w:lineRule="auto" w:before="0" w:after="100"/>
+        <w:spacing w:line="293" w:lineRule="auto" w:before="0" w:after="90"/>
       </w:pPr>
       <w:r>
         <w:rPr>
           <w:rFonts w:ascii="Calibri" w:hAnsi="Calibri"/>
           <w:b/>
           <w:color w:val="262626"/>
-          <w:sz w:val="21"/>
+          <w:sz w:val="20"/>
         </w:rPr>
-        <w:t xml:space="preserve">Core Component Curation and Quality Exclusion: </w:t>
+        <w:t xml:space="preserve">Curated Pathway Repertoire: </w:t>
       </w:r>
       <w:r>
         <w:rPr>
           <w:rFonts w:ascii="Calibri" w:hAnsi="Calibri"/>
           <w:color w:val="262626"/>
-          <w:sz w:val="21"/>
+          <w:sz w:val="20"/>
         </w:rPr>
-        <w:t>A foundational catalog of 74 curated core components across seven DNA repair pathways was established (Sheet DSB: 29 components spanning NHEJ, HR, and A-EJ; Sheet SSB: 45 components spanning BER, NER, MMR, and FA). Data completeness and sequencing depth audits across all flight biospecimens were conducted. Neil2 (ENSMUSG00000035121) exhibited recurrent sequencing dropout and zero-count sparsity across multiple flight tissue libraries, and was therefore systematically excluded from the final 45-component SSB analytical matrix and documented in a dedicated quality exclusion audit table (02_SSB_component_stable_id_mapping_without_Neil2.csv).</w:t>
+        <w:t>Analyses queried the MSigDB Hallmark collection (2026.1.Mm; Supplementary Figure S1) and 15 curated Gene Ontology Biological Process (GO:BP) terms (Figure 1c). The GO panel incorporates the core root term for DNA damage response (GO:0006974), sub-pathway branches (DNA repair GO:0006281; DNA damage signal transduction GO:0042770; Intrinsic apoptotic signaling GO:0008630; DNA damage tolerance GO:0006301; Telomere maintenance in response to DNA damage GO:0043247; Chromosome telomeric region GO:0000781), physiological context terms (Cell cycle GO:0007049; DNA replication GO:0006260; Transcription GO:0006351; Translation GO:0006412; Mitochondrion GO:0005739; Cytoskeleton GO:0005856), and comparative mechanosensory processes (Sensory perception of mechanical stimulus GO:0050954; Cell death GO:0008219).</w:t>
       </w:r>
     </w:p>
     <w:p>
       <w:pPr>
-        <w:spacing w:line="300" w:lineRule="auto" w:before="0" w:after="100"/>
+        <w:spacing w:line="293" w:lineRule="auto" w:before="0" w:after="90"/>
       </w:pPr>
       <w:r>
         <w:rPr>
           <w:rFonts w:ascii="Calibri" w:hAnsi="Calibri"/>
           <w:b/>
           <w:color w:val="262626"/>
-          <w:sz w:val="21"/>
+          <w:sz w:val="20"/>
         </w:rPr>
-        <w:t xml:space="preserve">Seven-Pathway Repertoire Benchmarking: </w:t>
+        <w:t xml:space="preserve">Mission-Equal NES and Exact Permutation Statistics: </w:t>
       </w:r>
       <w:r>
         <w:rPr>
           <w:rFonts w:ascii="Calibri" w:hAnsi="Calibri"/>
           <w:color w:val="262626"/>
-          <w:sz w:val="21"/>
+          <w:sz w:val="20"/>
         </w:rPr>
-        <w:t>In parallel, full pathway repertoire coverage was characterized across 335 total cataloged DNA repair genes: Base Excision Repair (BER, n = 54), Nucleotide Excision Repair (NER, n = 53), Mismatch Repair (MMR, n = 27), Fanconi Anemia (FA, n = 39), Homologous Recombination (HR, n = 135), Alternative End Joining (A-EJ, n = 9), and Non-Homologous End Joining (NHEJ, n = 18). Per-sample gene coverage was tracked to confirm robust library representation across all 761 source samples (Fig. S5).</w:t>
+        <w:t>To prevent large missions from exerting disproportionate leverage, Normalized Enrichment Scores (NES) were aggregated via unweighted arithmetic averaging across contributing missions within each tissue. Empirical significance was verified via exact sign-flip two-sided permutation testing across all 2^m sign configurations, coupled with Stouffer meta-Z transformation and Benjamini-Hochberg False Discovery Rate (FDR) multiple testing correction. Figure 1c presents the complete 26 × 15 matrix with a fine blue–white–red continuous gradient.</w:t>
       </w:r>
     </w:p>
     <w:p>
@@ -262,79 +262,71 @@
           <w:rFonts w:ascii="Arial" w:hAnsi="Arial"/>
           <w:b/>
           <w:color w:val="1F4E78"/>
-          <w:sz w:val="25"/>
+          <w:sz w:val="24"/>
         </w:rPr>
-        <w:t>3. Cross-Tissue Quantile Smoothing Normalization (YARN / qsmooth)</w:t>
+        <w:t>3. Sample-Level Pathway Co-Regulation and Cross-Tissue Fisher-z Integration (Figure 2, Supplementary Figure S6)</w:t>
       </w:r>
     </w:p>
     <w:p>
       <w:pPr>
-        <w:spacing w:line="300" w:lineRule="auto" w:before="0" w:after="100"/>
+        <w:spacing w:line="293" w:lineRule="auto" w:before="0" w:after="90"/>
       </w:pPr>
       <w:r>
         <w:rPr>
           <w:rFonts w:ascii="Calibri" w:hAnsi="Calibri"/>
           <w:b/>
           <w:color w:val="262626"/>
-          <w:sz w:val="21"/>
+          <w:sz w:val="20"/>
         </w:rPr>
-        <w:t xml:space="preserve">Algorithmic Framework: </w:t>
+        <w:t xml:space="preserve">Analytical Rationale: </w:t>
       </w:r>
       <w:r>
         <w:rPr>
           <w:rFonts w:ascii="Calibri" w:hAnsi="Calibri"/>
           <w:color w:val="262626"/>
-          <w:sz w:val="21"/>
+          <w:sz w:val="20"/>
         </w:rPr>
-        <w:t>To mitigate technical batch artifacts, library depth disparities, and platform variances across the 48 independent OSDR accessions while rigorously preserving bona fide tissue-specific transcriptional architectures, cross-tissue expression normalization was conducted using the YARN framework implementing tissue-aware quantile smoothing (qsmooth; Bioconductor package yarn / qsmooth).</w:t>
+        <w:t>To capture coordinated biological regulation across the 15 GO processes without suffering from ecological aggregation fallacies, a sample-level correlation framework was executed (python/plot_log2fc_per_tissue_pathway_spearman_20260902.py; Figure 2, Supplementary Figure S6).</w:t>
       </w:r>
     </w:p>
     <w:p>
       <w:pPr>
-        <w:spacing w:line="300" w:lineRule="auto" w:before="0" w:after="100"/>
+        <w:spacing w:line="293" w:lineRule="auto" w:before="0" w:after="90"/>
       </w:pPr>
       <w:r>
         <w:rPr>
           <w:rFonts w:ascii="Calibri" w:hAnsi="Calibri"/>
           <w:b/>
           <w:color w:val="262626"/>
-          <w:sz w:val="21"/>
+          <w:sz w:val="20"/>
         </w:rPr>
-        <w:t xml:space="preserve">Quantile Weight Formulation: </w:t>
+        <w:t xml:space="preserve">Mathematical Formulation and Pooling Criteria: </w:t>
       </w:r>
       <w:r>
         <w:rPr>
           <w:rFonts w:ascii="Calibri" w:hAnsi="Calibri"/>
           <w:color w:val="262626"/>
-          <w:sz w:val="21"/>
+          <w:sz w:val="20"/>
         </w:rPr>
-        <w:t>Conventional quantile normalization forcibly enforces identical empirical distribution shapes across all libraries, which erroneously eliminates biological differences when profiling highly heterogeneous organ systems (e.g., spleen vs brain). In contrast, qsmooth computes quantile-specific weights w_q based on the ratio of between-tissue variance to total (between- plus within-tissue) variance across all quantiles q ∈ [0, 1]:</w:t>
+        <w:t>1. Ground-Referenced Sample-Level log2FC: For each flight animal k within a given accession and tissue, sample-level expression was referenced against matched ground controls:</w:t>
         <w:br/>
-        <w:t xml:space="preserve">        w_q = Var_between(q) / [Var_between(q) + Var_within(q)]</w:t>
+        <w:t xml:space="preserve">        Sample_log2FC_k = log2(Expr_flight_k + 1) - &lt;log2(Expr_ground + 1)&gt;_accession, tissue</w:t>
         <w:br/>
-        <w:t>At quantiles where within-tissue technical noise dominates (w_q → 0), values are normalized toward the global cross-tissue empirical distribution. Conversely, at quantiles where authentic between-tissue biological divergence dominates (w_q → 1), tissue-specific quantile distributions are preserved.</w:t>
-      </w:r>
-    </w:p>
-    <w:p>
-      <w:pPr>
-        <w:spacing w:line="300" w:lineRule="auto" w:before="0" w:after="100"/>
-      </w:pPr>
-      <w:r>
-        <w:rPr>
-          <w:rFonts w:ascii="Calibri" w:hAnsi="Calibri"/>
-          <w:b/>
-          <w:color w:val="262626"/>
-          <w:sz w:val="21"/>
-        </w:rPr>
-        <w:t xml:space="preserve">Logarithmic and Linear Scale Transformation: </w:t>
-      </w:r>
-      <w:r>
-        <w:rPr>
-          <w:rFonts w:ascii="Calibri" w:hAnsi="Calibri"/>
-          <w:color w:val="262626"/>
-          <w:sz w:val="21"/>
-        </w:rPr>
-        <w:t>Normalized counts were log2-transformed with a unit pseudocount: YARNNormalizedLog2 = log2(Normalized Count + 1). For linear-scale abundance evaluations and publication boxplots, values were back-transformed to the linear expression scale via: Expression_linear = 2^(YARNNormalizedLog2) - 1.</w:t>
+        <w:t>The sample-level pathway activation score was defined as the mean log2FC of constituent member genes.</w:t>
+        <w:br/>
+        <w:t>2. Intra-Tissue Spearman Correlation: Within each of the 26 tissues, taking individual flight mice (n = 360) as independent observation units, pairwise non-parametric Spearman rank correlation coefficients (ρ_ij) were computed across the 15 GO terms, generating 26 distinct 15 × 15 correlation matrices (Supplementary Figure S6).</w:t>
+        <w:br/>
+        <w:t>3. Fisher-z Meta-Aggregation: Intra-tissue correlation coefficients were transformed into normally distributed z-scores:</w:t>
+        <w:br/>
+        <w:t xml:space="preserve">        z = arctanh(ρ) = 0.5 · ln[(1 + ρ) / (1 - ρ)]</w:t>
+        <w:br/>
+        <w:t>Correlations were bounded within [-1 + 10^(-12), 1 - 10^(-12)], and z-scores were capped at |z| ≤ 5.0.</w:t>
+        <w:br/>
+        <w:t>4. Cross-Tissue Pooling Criteria: An unweighted arithmetic mean z̄ was calculated across the 23 eligible tissues satisfying the sample-size threshold (n_flight ≥ 5; Colon [n = 4], Heart [n = 3], and Femoral skin [n = 2] were retained in individual panels but excluded from cross-tissue pooling). The pooled z̄ was back-transformed to derive the overall meta-analytic Spearman rank correlation:</w:t>
+        <w:br/>
+        <w:t xml:space="preserve">        ρ̄ = tanh(z̄) = [exp(2z̄) - 1] / [exp(2z̄) + 1]</w:t>
+        <w:br/>
+        <w:t>The resulting 15 × 15 consensus matrix is presented in Figure 2.</w:t>
       </w:r>
     </w:p>
     <w:p>
@@ -347,83 +339,57 @@
           <w:rFonts w:ascii="Arial" w:hAnsi="Arial"/>
           <w:b/>
           <w:color w:val="1F4E78"/>
-          <w:sz w:val="25"/>
+          <w:sz w:val="24"/>
         </w:rPr>
-        <w:t>4. Differential Expression Analysis and Mission-Level Effect Summarization</w:t>
+        <w:t>4. Organ-Specific Repertoires, UpSet Intersections, and Common-Direction DEG Prioritization (Figure 3a, 3b, Supplementary Figures S2–S4)</w:t>
       </w:r>
     </w:p>
     <w:p>
       <w:pPr>
-        <w:spacing w:line="300" w:lineRule="auto" w:before="0" w:after="100"/>
+        <w:spacing w:line="293" w:lineRule="auto" w:before="0" w:after="90"/>
       </w:pPr>
       <w:r>
         <w:rPr>
           <w:rFonts w:ascii="Calibri" w:hAnsi="Calibri"/>
           <w:b/>
           <w:color w:val="262626"/>
-          <w:sz w:val="21"/>
+          <w:sz w:val="20"/>
         </w:rPr>
-        <w:t xml:space="preserve">Negative Binomial Modeling: </w:t>
+        <w:t xml:space="preserve">Repertoire Overlap and UpSet Topology: </w:t>
       </w:r>
       <w:r>
         <w:rPr>
           <w:rFonts w:ascii="Calibri" w:hAnsi="Calibri"/>
           <w:color w:val="262626"/>
-          <w:sz w:val="21"/>
+          <w:sz w:val="20"/>
         </w:rPr>
-        <w:t>Differential expression between spaceflight mice and matched ground controls was estimated within each OSDR accession using negative binomial generalized linear models in DESeq2. Contrast orientations were audited via orientation_multiplier flags to guarantee uniform directional consistency (Spaceflight vs. Ground).</w:t>
+        <w:t>To examine shared and tissue-specific responsive elements within the core DDR machinery (GO:0006974), overlapping DEG repertoires were evaluated across multi-dataset organs, specifically Thymus (4 flight comparisons, Figure 3a) and Kidney (5 independent OSDR datasets, Supplementary Figure S2a) using ggVennDiagram. Organ-wide intersection topology across NES &gt; 1 tissues (excluding Kidney, Supplementary Figure S3a) and NES &lt; -1 tissues (excluding Lung and Thymus, Supplementary Figure S4a) was resolved using UpSet intersection geometry (R/figures/06_go_upsets.R).</w:t>
       </w:r>
     </w:p>
     <w:p>
       <w:pPr>
-        <w:spacing w:line="300" w:lineRule="auto" w:before="0" w:after="100"/>
+        <w:spacing w:line="293" w:lineRule="auto" w:before="0" w:after="90"/>
       </w:pPr>
       <w:r>
         <w:rPr>
           <w:rFonts w:ascii="Calibri" w:hAnsi="Calibri"/>
           <w:b/>
           <w:color w:val="262626"/>
-          <w:sz w:val="21"/>
+          <w:sz w:val="20"/>
         </w:rPr>
-        <w:t xml:space="preserve">Sample-Level Ground-Referenced log2FC: </w:t>
+        <w:t xml:space="preserve">Common-Direction Screening Formulation: </w:t>
       </w:r>
       <w:r>
         <w:rPr>
           <w:rFonts w:ascii="Calibri" w:hAnsi="Calibri"/>
           <w:color w:val="262626"/>
-          <w:sz w:val="21"/>
+          <w:sz w:val="20"/>
         </w:rPr>
-        <w:t>To capture individual flight animal variability relative to baseline, sample-level ground-referenced log2 fold changes were computed. For each flight mouse k within a given accession and tissue:</w:t>
+        <w:t>To prioritize core genes demonstrating conserved responsiveness independent of mission idiosyncrasies, common-direction filtering was executed (python/plot_common_direction_heatmaps.py; Figure 3b, Supplementary Figure S2b, S3b, S4b). Candidate DEGs were required to demonstrate uniform directional concordance (all log2FC &gt; 0 or all log2FC &lt; 0) across all parallel dataset comparisons at nominal P &lt; 0.05 (or P &lt; 0.10 for global NES-stratified cohorts). Qualifying genes were ranked by their minimum absolute fold change across comparisons:</w:t>
         <w:br/>
-        <w:t xml:space="preserve">        Sample_log2FC_k = log2(Expr_flight_k + 1) - &lt;log2(Expr_ground + 1)&gt;_accession, tissue</w:t>
+        <w:t xml:space="preserve">        Score_g = min_c |log2FC_{g, c}|</w:t>
         <w:br/>
-        <w:t>where &lt;·&gt; represents the arithmetic mean log2 baseline of all matched ground-control mice from the identical study accession and tissue.</w:t>
-      </w:r>
-    </w:p>
-    <w:p>
-      <w:pPr>
-        <w:spacing w:line="300" w:lineRule="auto" w:before="0" w:after="100"/>
-      </w:pPr>
-      <w:r>
-        <w:rPr>
-          <w:rFonts w:ascii="Calibri" w:hAnsi="Calibri"/>
-          <w:b/>
-          <w:color w:val="262626"/>
-          <w:sz w:val="21"/>
-        </w:rPr>
-        <w:t xml:space="preserve">Multi-Mission Meta-Aggregation and Signed Stouffer Test: </w:t>
-      </w:r>
-      <w:r>
-        <w:rPr>
-          <w:rFonts w:ascii="Calibri" w:hAnsi="Calibri"/>
-          <w:color w:val="262626"/>
-          <w:sz w:val="21"/>
-        </w:rPr>
-        <w:t>To synthesize flight impact across heterogeneous missions without distortion by statistical outliers, mission-level median log2FC values were computed, and the cross-mission consensus was determined as the median of mission medians (Fig. 4b, Fig. 5b). Statistical meta-significance across m missions was evaluated using signed Stouffer's Z-trend integration:</w:t>
-        <w:br/>
-        <w:t xml:space="preserve">        Z_meta = [∑_{i=1}^m sign(log2FC_i) · Φ^(-1)(1 - P_i / 2)] / √m</w:t>
-        <w:br/>
-        <w:t>where Φ^(-1) is the standard normal inverse cumulative distribution function. The resulting Z_meta and two-sided nominal P-values capture both the magnitude and directional consistency of spaceflight-induced transcriptional shifts.</w:t>
+        <w:t>The top 30 ranked common-direction genes were displayed as heatmaps with standardized blue–white–red color gradients and exact log2FC text overlays.</w:t>
       </w:r>
     </w:p>
     <w:p>
@@ -436,75 +402,130 @@
           <w:rFonts w:ascii="Arial" w:hAnsi="Arial"/>
           <w:b/>
           <w:color w:val="1F4E78"/>
-          <w:sz w:val="25"/>
+          <w:sz w:val="24"/>
         </w:rPr>
-        <w:t>5. Gene Set Enrichment Analysis (GSEA) and Gene Ontology Pathway Profiling</w:t>
+        <w:t>5. Double-Strand Break (DSB) Repair Architecture: Baseline Clustering, Individual Linear Boxplots, and Spaceflight Meta-Analysis (Figure 4a–e)</w:t>
       </w:r>
     </w:p>
     <w:p>
       <w:pPr>
-        <w:spacing w:line="300" w:lineRule="auto" w:before="0" w:after="100"/>
+        <w:keepNext/>
+        <w:spacing w:before="180" w:after="60"/>
+      </w:pPr>
+      <w:r>
+        <w:rPr>
+          <w:rFonts w:ascii="Arial" w:hAnsi="Arial"/>
+          <w:b/>
+          <w:color w:val="2E75B6"/>
+          <w:sz w:val="22"/>
+        </w:rPr>
+        <w:t>5.1 Baseline Quantile Smoothing (YARN / qsmooth) and Hierarchical Clustering (Figure 4a)</w:t>
+      </w:r>
+    </w:p>
+    <w:p>
+      <w:pPr>
+        <w:spacing w:line="293" w:lineRule="auto" w:before="0" w:after="90"/>
       </w:pPr>
       <w:r>
         <w:rPr>
           <w:rFonts w:ascii="Calibri" w:hAnsi="Calibri"/>
           <w:b/>
           <w:color w:val="262626"/>
-          <w:sz w:val="21"/>
+          <w:sz w:val="20"/>
         </w:rPr>
-        <w:t xml:space="preserve">Pre-Ranked fgsea Multilevel Modeling: </w:t>
+        <w:t xml:space="preserve">Normalization and Dendrogram Clustering: </w:t>
       </w:r>
       <w:r>
         <w:rPr>
           <w:rFonts w:ascii="Calibri" w:hAnsi="Calibri"/>
           <w:color w:val="262626"/>
-          <w:sz w:val="21"/>
+          <w:sz w:val="20"/>
         </w:rPr>
-        <w:t>Functional pathway enrichment was evaluated via pre-ranked Gene Set Enrichment Analysis using fgseaMultilevel (fgsea package; R 4.4.3), with pseudo-random seeds locked at seed = 25. Genes within each comparison were ranked by signed differential Wald statistics: S = sign(log2FC) · (-log10 P_nominal).</w:t>
+        <w:t>To mitigate technical batch artifacts while preserving bona fide tissue-specific transcriptional baselines, cross-tissue expression normalization was performed using the YARN framework implementing tissue-aware quantile smoothing (qsmooth). For the DSB repair module, 29 curated components spanning NHEJ (7 components), HR (14 components), HR–A-EJ shared factors (3 components), and A-EJ (5 components) were assembled. Pairwise topological dissimilarity between tissues Ta and Tb was computed on baseline normalized expression (YARNNormalizedLog2) via Spearman rank distance: D(Ta, Tb) = 1 - ρ_Spearman(Ta, Tb). Hierarchical agglomerative clustering was executed using average linkage (hclust(as.dist(D), method = 'average')), defining the stable dendrogram order for Figure 4a.</w:t>
       </w:r>
     </w:p>
     <w:p>
       <w:pPr>
-        <w:spacing w:line="300" w:lineRule="auto" w:before="0" w:after="100"/>
+        <w:keepNext/>
+        <w:spacing w:before="180" w:after="60"/>
+      </w:pPr>
+      <w:r>
+        <w:rPr>
+          <w:rFonts w:ascii="Arial" w:hAnsi="Arial"/>
+          <w:b/>
+          <w:color w:val="2E75B6"/>
+          <w:sz w:val="22"/>
+        </w:rPr>
+        <w:t>5.2 Tissue-Stratified Individual Linear Abundance Modeling and One-Way ANOVA (Figure 4b–d)</w:t>
+      </w:r>
+    </w:p>
+    <w:p>
+      <w:pPr>
+        <w:spacing w:line="293" w:lineRule="auto" w:before="0" w:after="90"/>
       </w:pPr>
       <w:r>
         <w:rPr>
           <w:rFonts w:ascii="Calibri" w:hAnsi="Calibri"/>
           <w:b/>
           <w:color w:val="262626"/>
-          <w:sz w:val="21"/>
+          <w:sz w:val="20"/>
         </w:rPr>
-        <w:t xml:space="preserve">Curated Pathway Repertoire: </w:t>
+        <w:t xml:space="preserve">Linear Scale Formulation, Boxplot Geometry, and ANOVA Testing: </w:t>
       </w:r>
       <w:r>
         <w:rPr>
           <w:rFonts w:ascii="Calibri" w:hAnsi="Calibri"/>
           <w:color w:val="262626"/>
-          <w:sz w:val="21"/>
+          <w:sz w:val="20"/>
         </w:rPr>
-        <w:t>Analyses queried the MSigDB Hallmark collection (2026.1.Mm, Fig. S1) and 15 curated Gene Ontology Biological Process (GO:BP) terms (Fig. 1c). The GO panel incorporates the core root term for DNA damage response (GO:0006974), sub-pathway branches (DNA repair GO:0006281; DNA damage signal transduction GO:0042770; Intrinsic apoptotic signaling GO:0008630; DNA damage tolerance GO:0006301; Telomere maintenance in response to DNA damage GO:0043247; Chromosome telomeric region GO:0000781), physiological context terms (Cell cycle GO:0007049; DNA replication GO:0006260; Transcription GO:0006351; Translation GO:0006412; Mitochondrion GO:0005739; Cytoskeleton GO:0005856), and comparative mechanosensory processes (Sensory perception of mechanical stimulus GO:0050954; Cell death GO:0008219).</w:t>
+        <w:t>To assess physiological baseline expression and organ-level heterogeneity across the mammalian DSB repair machinery, key biological marker genes were selected and displayed on a linear expression scale (Expression_linear = 2^(YARNNormalizedLog2) - 1) across the 26 canonical tissues:</w:t>
+        <w:br/>
+        <w:t>• Figure 4b (NHEJ, 4 genes): Nhej1 / XLF (ENSMUSG00000026162), Paxx (ENSMUSG00000047617), Xrcc6 / Ku70 (ENSMUSG00000022471), Xrcc5 / Ku80 (ENSMUSG00000026187).</w:t>
+        <w:br/>
+        <w:t>• Figure 4c (HR, 4 genes): Brca1 (ENSMUSG00000017146), Bard1 (ENSMUSG00000026196), Blm (ENSMUSG00000030528), Rad51 (ENSMUSG00000027323).</w:t>
+        <w:br/>
+        <w:t>• Figure 4d (A-EJ, 4 genes): Parp1 (ENSMUSG00000026496), Polq (ENSMUSG00000034206), Lig1 (ENSMUSG00000056394), Lig3 (ENSMUSG00000020697).</w:t>
+        <w:br/>
+        <w:t>Boxplot Construction: The lower hinge represents Q1 (25%); the center solid line represents the sample mean (μ); the upper hinge represents Q3 (75%). Whiskers extend to the furthest observations within 1.5 × IQR. Individual flight mice biospecimens (n = 360) are overlaid as jittered points (dodge.width = 0.80, jitter.width = 0.11, seed = 25). Dashed lines connect tissue-level mean values for each gene.</w:t>
+        <w:br/>
+        <w:t>One-Way ANOVA: Tissue heterogeneity was evaluated via ordinary One-way ANOVA. Both gene-level tests (df_group = 25, df_residual = 334) and pathway-level tests (modeled on per-mouse mean pathway abundance) were conducted, with exact F-statistics and scientific P-values printed in figure subtitles: NHEJ (Pathway F = 47.99, P = 6.82 × 10^(-95)), HR (Pathway F = 39.53, P = 2.37 × 10^(-84)), and A-EJ (Pathway F = 42.60, P = 2.37 × 10^(-88)).</w:t>
       </w:r>
     </w:p>
     <w:p>
       <w:pPr>
-        <w:spacing w:line="300" w:lineRule="auto" w:before="0" w:after="100"/>
+        <w:keepNext/>
+        <w:spacing w:before="180" w:after="60"/>
+      </w:pPr>
+      <w:r>
+        <w:rPr>
+          <w:rFonts w:ascii="Arial" w:hAnsi="Arial"/>
+          <w:b/>
+          <w:color w:val="2E75B6"/>
+          <w:sz w:val="22"/>
+        </w:rPr>
+        <w:t>5.3 Spaceflight-Induced Meta-Differential Expression Analysis (Figure 4e)</w:t>
+      </w:r>
+    </w:p>
+    <w:p>
+      <w:pPr>
+        <w:spacing w:line="293" w:lineRule="auto" w:before="0" w:after="90"/>
       </w:pPr>
       <w:r>
         <w:rPr>
           <w:rFonts w:ascii="Calibri" w:hAnsi="Calibri"/>
           <w:b/>
           <w:color w:val="262626"/>
-          <w:sz w:val="21"/>
+          <w:sz w:val="20"/>
         </w:rPr>
-        <w:t xml:space="preserve">Mission-Equal NES and Exact Permutation Statistics: </w:t>
+        <w:t xml:space="preserve">Meta-Dotplot Construction: </w:t>
       </w:r>
       <w:r>
         <w:rPr>
           <w:rFonts w:ascii="Calibri" w:hAnsi="Calibri"/>
           <w:color w:val="262626"/>
-          <w:sz w:val="21"/>
+          <w:sz w:val="20"/>
         </w:rPr>
-        <w:t>To prevent large missions from exerting disproportionate leverage, Normalized Enrichment Scores (NES) were aggregated via unweighted arithmetic averaging across contributing missions within each tissue. Empirical significance was verified via exact sign-flip two-sided permutation testing across all 2^m sign configurations, coupled with Stouffer meta-Z transformation and Benjamini-Hochberg False Discovery Rate (FDR) multiple testing correction.</w:t>
+        <w:t>To characterize spaceflight-induced perturbations across all 29 DSB components, multi-mission meta-analysis was performed (Figure 4e). Effect sizes are presented as the median of mission-level median log2FC values. Meta-significance across missions was integrated via signed Stouffer's Z-trend test: Z_meta = [∑ sign(log2FC_i) · Φ^(-1)(1 - P_i / 2)] / √m. Dot color reflects median log2FC and dot diameter scales with -log10(P_meta).</w:t>
       </w:r>
     </w:p>
     <w:p>
@@ -517,63 +538,132 @@
           <w:rFonts w:ascii="Arial" w:hAnsi="Arial"/>
           <w:b/>
           <w:color w:val="1F4E78"/>
-          <w:sz w:val="25"/>
+          <w:sz w:val="24"/>
         </w:rPr>
-        <w:t>6. Sample-Level Cross-Tissue Pathway Co-Regulation and Fisher-z Integration</w:t>
+        <w:t>6. Single-Strand Break (SSB) Repair Architecture: Baseline Clustering, Individual Linear Boxplots, and Spaceflight Meta-Analysis (Figure 5a–f)</w:t>
       </w:r>
     </w:p>
     <w:p>
       <w:pPr>
-        <w:spacing w:line="300" w:lineRule="auto" w:before="0" w:after="100"/>
+        <w:keepNext/>
+        <w:spacing w:before="180" w:after="60"/>
+      </w:pPr>
+      <w:r>
+        <w:rPr>
+          <w:rFonts w:ascii="Arial" w:hAnsi="Arial"/>
+          <w:b/>
+          <w:color w:val="2E75B6"/>
+          <w:sz w:val="22"/>
+        </w:rPr>
+        <w:t>6.1 Baseline Quantile Smoothing, Neil2 Exclusion Audit, and Hierarchical Clustering (Figure 5a)</w:t>
+      </w:r>
+    </w:p>
+    <w:p>
+      <w:pPr>
+        <w:spacing w:line="293" w:lineRule="auto" w:before="0" w:after="90"/>
       </w:pPr>
       <w:r>
         <w:rPr>
           <w:rFonts w:ascii="Calibri" w:hAnsi="Calibri"/>
           <w:b/>
           <w:color w:val="262626"/>
-          <w:sz w:val="21"/>
+          <w:sz w:val="20"/>
         </w:rPr>
-        <w:t xml:space="preserve">Analytical Rationale: </w:t>
+        <w:t xml:space="preserve">Quality Exclusion Audit and Dendrogram Topology: </w:t>
       </w:r>
       <w:r>
         <w:rPr>
           <w:rFonts w:ascii="Calibri" w:hAnsi="Calibri"/>
           <w:color w:val="262626"/>
-          <w:sz w:val="21"/>
+          <w:sz w:val="20"/>
         </w:rPr>
-        <w:t>To quantify coordinated pathway co-regulation across the 15 GO biological processes, we implemented a sample-level correlation framework rather than relying on aggregated tissue means (build_log2fc_per_tissue_pathway_spearman_20260902.py, Fig. 2, Fig. S6).</w:t>
+        <w:t>Cross-tissue baseline normalization for the single-strand break and base excision machinery encompassed 45 curated components spanning BER (6 components), NER (18 components), MMR (5 components), and FA (16 components). Data completeness audits across all flight biospecimens identified recurrent sequencing dropout and high zero-count sparsity for Neil2 (ENSMUSG00000035121); Neil2 was therefore systematically excluded from the 45-component SSB matrix and audited in 02_SSB_component_stable_id_mapping_without_Neil2.csv. Pairwise topological distance was computed on baseline YARNNormalizedLog2 via Spearman rank distance (D = 1 - ρ), followed by average-linkage hierarchical clustering to generate Figure 5a.</w:t>
       </w:r>
     </w:p>
     <w:p>
       <w:pPr>
-        <w:spacing w:line="300" w:lineRule="auto" w:before="0" w:after="100"/>
+        <w:keepNext/>
+        <w:spacing w:before="180" w:after="60"/>
+      </w:pPr>
+      <w:r>
+        <w:rPr>
+          <w:rFonts w:ascii="Arial" w:hAnsi="Arial"/>
+          <w:b/>
+          <w:color w:val="2E75B6"/>
+          <w:sz w:val="22"/>
+        </w:rPr>
+        <w:t>6.2 Tissue-Stratified Individual Linear Abundance Modeling and One-Way ANOVA (Figure 5b–e)</w:t>
+      </w:r>
+    </w:p>
+    <w:p>
+      <w:pPr>
+        <w:spacing w:line="293" w:lineRule="auto" w:before="0" w:after="90"/>
       </w:pPr>
       <w:r>
         <w:rPr>
           <w:rFonts w:ascii="Calibri" w:hAnsi="Calibri"/>
           <w:b/>
           <w:color w:val="262626"/>
-          <w:sz w:val="21"/>
+          <w:sz w:val="20"/>
         </w:rPr>
-        <w:t xml:space="preserve">Mathematical Formulation: </w:t>
+        <w:t xml:space="preserve">Marker Gene Selection, Glyphic Coding, and ANOVA Testing: </w:t>
       </w:r>
       <w:r>
         <w:rPr>
           <w:rFonts w:ascii="Calibri" w:hAnsi="Calibri"/>
           <w:color w:val="262626"/>
-          <w:sz w:val="21"/>
+          <w:sz w:val="20"/>
         </w:rPr>
-        <w:t>1. Intra-Tissue Correlation: Within each of the 26 tissues, taking individual flight mice (n = 360) as independent observation units, the sample-level pathway score was defined as the mean member-gene log2FC. Pairwise non-parametric Spearman rank correlation coefficients (ρ_ij) were computed across the 15 GO terms, generating 26 distinct 15 × 15 correlation matrices (Fig. S6).</w:t>
+        <w:t>Key marker genes across the four SSB pathways were evaluated on the linear expression scale (2^(log2) - 1) across 360 flight mice in 26 tissues:</w:t>
         <w:br/>
-        <w:t>2. Fisher-z Meta-Aggregation: To synthesize an organism-wide pathway co-regulation matrix (Fig. 2) without sample-size distortion, intra-tissue correlation coefficients were transformed into normally distributed z-scores via Fisher's z-transformation:</w:t>
+        <w:t>• Figure 5b (BER, 3 genes): Ung (ENSMUSG00000029591), Ogg1 (ENSMUSG00000030271), Neil1 (ENSMUSG00000032298).</w:t>
         <w:br/>
-        <w:t xml:space="preserve">        z = arctanh(ρ) = 0.5 · ln[(1 + ρ) / (1 - ρ)]</w:t>
+        <w:t>• Figure 5c (NER, 7 genes): Xpc (ENSMUSG00000030094), Rad23b (ENSMUSG00000028426), Cetn2 (ENSMUSG00000031347), Ddb1 (ENSMUSG00000024740), Ddb2 (ENSMUSG00000002109), Ercc6 (ENSMUSG00000054051), Ercc8 (ENSMUSG00000021694).</w:t>
         <w:br/>
-        <w:t>To guarantee numerical stability, correlations were bounded within [-1 + 10^(-12), 1 - 10^(-12)], and z-scores were capped at |z| ≤ 5.0.</w:t>
+        <w:t xml:space="preserve">  NER Glyphic Disambiguation: Recognition complexes are encoded by paired color-and-shape glyphs: XPC/RAD23B/CETN2 (amber; cross ✕, triangle ▲, circle ●); DDB1/DDB2 (teal; cross ✕, triangle ▲); ERCC6/ERCC8 (blue; cross ✕, triangle ▲).</w:t>
         <w:br/>
-        <w:t>3. Cross-Tissue Pooling Criteria: An unweighted arithmetic mean z̄ was calculated across the 23 eligible tissues satisfying the sample-size threshold (n_flight ≥ 5; Colon [n = 4], Heart [n = 3], and Femoral skin [n = 2] were retained in individual panels but excluded from cross-tissue pooling). The pooled z̄ was back-transformed to derive the overall meta-analytic Spearman rank correlation:</w:t>
+        <w:t>• Figure 5d (MMR, 2 genes): Msh2 (ENSMUSG00000024151), Msh3 (ENSMUSG00000014850).</w:t>
         <w:br/>
-        <w:t xml:space="preserve">        ρ̄ = tanh(z̄) = [exp(2z̄) - 1] / [exp(2z̄) + 1]</w:t>
+        <w:t>• Figure 5e (FA, 2 genes): Fancd2 (ENSMUSG00000034023), Fanci (ENSMUSG00000039187). (df_group = 25, df_residual = 330 due to 4 missing observations).</w:t>
+        <w:br/>
+        <w:t>One-Way ANOVA: Cross-tissue expression heterogeneity was highly significant across all pathways: BER (Pathway F = 32.44, P = 3.49 × 10^(-74)), NER (Pathway F = 89.47, P = 7.98 × 10^(-132)), MMR (Pathway F = 56.20, P = 7.71 × 10^(-104)), and FA (Pathway F = 31.47, P = 2.86 × 10^(-72)).</w:t>
+      </w:r>
+    </w:p>
+    <w:p>
+      <w:pPr>
+        <w:keepNext/>
+        <w:spacing w:before="180" w:after="60"/>
+      </w:pPr>
+      <w:r>
+        <w:rPr>
+          <w:rFonts w:ascii="Arial" w:hAnsi="Arial"/>
+          <w:b/>
+          <w:color w:val="2E75B6"/>
+          <w:sz w:val="22"/>
+        </w:rPr>
+        <w:t>6.3 Spaceflight-Induced Meta-Differential Expression Analysis (Figure 5f)</w:t>
+      </w:r>
+    </w:p>
+    <w:p>
+      <w:pPr>
+        <w:spacing w:line="293" w:lineRule="auto" w:before="0" w:after="90"/>
+      </w:pPr>
+      <w:r>
+        <w:rPr>
+          <w:rFonts w:ascii="Calibri" w:hAnsi="Calibri"/>
+          <w:b/>
+          <w:color w:val="262626"/>
+          <w:sz w:val="20"/>
+        </w:rPr>
+        <w:t xml:space="preserve">Meta-Dotplot Construction: </w:t>
+      </w:r>
+      <w:r>
+        <w:rPr>
+          <w:rFonts w:ascii="Calibri" w:hAnsi="Calibri"/>
+          <w:color w:val="262626"/>
+          <w:sz w:val="20"/>
+        </w:rPr>
+        <w:t>To assess spaceflight transcriptional shifts across all 45 SSB components, multi-mission meta-analysis was performed (Figure 5f). Effect sizes represent the median of mission-level median log2FC values, and statistical significance was pooled using signed Stouffer's Z-trend integration, scaled by nominal P-value significance.</w:t>
       </w:r>
     </w:p>
     <w:p>
@@ -586,57 +676,31 @@
           <w:rFonts w:ascii="Arial" w:hAnsi="Arial"/>
           <w:b/>
           <w:color w:val="1F4E78"/>
-          <w:sz w:val="25"/>
+          <w:sz w:val="24"/>
         </w:rPr>
-        <w:t>7. Intersection Repertoires, UpSet Matrices, and Common-Direction DEG Prioritization</w:t>
+        <w:t>7. Seven-Pathway Repertoire Library Representation and Gene Coverage Auditing (Supplementary Figure S5)</w:t>
       </w:r>
     </w:p>
     <w:p>
       <w:pPr>
-        <w:spacing w:line="300" w:lineRule="auto" w:before="0" w:after="100"/>
+        <w:spacing w:line="293" w:lineRule="auto" w:before="0" w:after="90"/>
       </w:pPr>
       <w:r>
         <w:rPr>
           <w:rFonts w:ascii="Calibri" w:hAnsi="Calibri"/>
           <w:b/>
           <w:color w:val="262626"/>
-          <w:sz w:val="21"/>
+          <w:sz w:val="20"/>
         </w:rPr>
-        <w:t xml:space="preserve">Repertoire Overlap and UpSet Topology: </w:t>
+        <w:t xml:space="preserve">Catalog Completeness and Library Representation: </w:t>
       </w:r>
       <w:r>
         <w:rPr>
           <w:rFonts w:ascii="Calibri" w:hAnsi="Calibri"/>
           <w:color w:val="262626"/>
-          <w:sz w:val="21"/>
+          <w:sz w:val="20"/>
         </w:rPr>
-        <w:t>To examine shared and tissue-specific responsive elements within the core DDR machinery (GO:0006974), overlapping DEG repertoires were evaluated across multi-dataset organs, specifically Thymus (4 flight comparisons, Fig. 3a) and Kidney (5 independent OSDR datasets, Fig. S2a) using ggVennDiagram. Organ-wide intersection topology across NES &gt; 1 tissues (excluding Kidney, Fig. S3a) and NES &lt; -1 tissues (excluding Lung and Thymus, Fig. S4a) was resolved using UpSet intersection geometry.</w:t>
-      </w:r>
-    </w:p>
-    <w:p>
-      <w:pPr>
-        <w:spacing w:line="300" w:lineRule="auto" w:before="0" w:after="100"/>
-      </w:pPr>
-      <w:r>
-        <w:rPr>
-          <w:rFonts w:ascii="Calibri" w:hAnsi="Calibri"/>
-          <w:b/>
-          <w:color w:val="262626"/>
-          <w:sz w:val="21"/>
-        </w:rPr>
-        <w:t xml:space="preserve">Common-Direction Screening Formulation: </w:t>
-      </w:r>
-      <w:r>
-        <w:rPr>
-          <w:rFonts w:ascii="Calibri" w:hAnsi="Calibri"/>
-          <w:color w:val="262626"/>
-          <w:sz w:val="21"/>
-        </w:rPr>
-        <w:t>To prioritize core genes demonstrating conserved responsiveness independent of mission idiosyncrasies, common-direction filtering was executed (plot_common_direction_heatmaps.py; Fig. 3b, Fig. S2b, Fig. S3b, Fig. S4b). Candidate DEGs were required to demonstrate uniform directional concordance (all log2FC &gt; 0 or all log2FC &lt; 0) across all parallel dataset comparisons at nominal P &lt; 0.05 (or P &lt; 0.10 for global NES-stratified cohorts). Qualifying genes were ranked by their minimum absolute fold change across comparisons:</w:t>
-        <w:br/>
-        <w:t xml:space="preserve">        Score_g = min_c |log2FC_{g, c}|</w:t>
-        <w:br/>
-        <w:t>The top 30 ranked common-direction genes were displayed as heatmaps with standardized color gradients and exact log2FC text overlays.</w:t>
+        <w:t>To verify that pathway-level transcriptomic analyses were not compromised by library dropouts or incomplete capture across sequencing accessions, per-sample gene detection was audited against a master catalog of 335 DNA repair genes: BER (n = 54), NER (n = 53), MMR (n = 27), FA (n = 39), HR (n = 135), A-EJ (n = 9), and NHEJ (n = 18). Supplementary Figure S5 tracks the count of detected member genes across all 761 source samples (stratified by Ground and Flight), confirming comprehensive transcript coverage across all 26 anatomical tissues.</w:t>
       </w:r>
     </w:p>
     <w:p>
@@ -649,195 +713,21 @@
           <w:rFonts w:ascii="Arial" w:hAnsi="Arial"/>
           <w:b/>
           <w:color w:val="1F4E78"/>
-          <w:sz w:val="25"/>
+          <w:sz w:val="24"/>
         </w:rPr>
-        <w:t>8. Hierarchical Clustering and Topological Dendrogram Analysis</w:t>
+        <w:t>8. Computational Environment, Code Governance, and Reproducibility Standards</w:t>
       </w:r>
     </w:p>
     <w:p>
       <w:pPr>
-        <w:spacing w:line="300" w:lineRule="auto" w:before="0" w:after="100"/>
+        <w:spacing w:line="293" w:lineRule="auto" w:before="0" w:after="90"/>
       </w:pPr>
       <w:r>
         <w:rPr>
           <w:rFonts w:ascii="Calibri" w:hAnsi="Calibri"/>
           <w:b/>
           <w:color w:val="262626"/>
-          <w:sz w:val="21"/>
-        </w:rPr>
-        <w:t xml:space="preserve">Functional Module Partitioning: </w:t>
-      </w:r>
-      <w:r>
-        <w:rPr>
-          <w:rFonts w:ascii="Calibri" w:hAnsi="Calibri"/>
-          <w:color w:val="262626"/>
-          <w:sz w:val="21"/>
-        </w:rPr>
-        <w:t>To establish baseline tissue groupings based on DNA repair pathway expression, the 74 core components were partitioned into two functional modules: the Double-Strand Break (DSB) module (29 components across NHEJ, HR, and A-EJ; Fig. 4a) and the Single-Strand Break (SSB) module (45 components across BER, NER, MMR, and FA; Fig. 5a).</w:t>
-      </w:r>
-    </w:p>
-    <w:p>
-      <w:pPr>
-        <w:spacing w:line="300" w:lineRule="auto" w:before="0" w:after="100"/>
-      </w:pPr>
-      <w:r>
-        <w:rPr>
-          <w:rFonts w:ascii="Calibri" w:hAnsi="Calibri"/>
-          <w:b/>
-          <w:color w:val="262626"/>
-          <w:sz w:val="21"/>
-        </w:rPr>
-        <w:t xml:space="preserve">Clustering Algorithm and Topology Governance: </w:t>
-      </w:r>
-      <w:r>
-        <w:rPr>
-          <w:rFonts w:ascii="Calibri" w:hAnsi="Calibri"/>
-          <w:color w:val="262626"/>
-          <w:sz w:val="21"/>
-        </w:rPr>
-        <w:t>Pairwise topological dissimilarity between tissues Ta and Tb was defined on normalized baseline YARN qsmooth expression matrices using Spearman rank distance: D(Ta, Tb) = 1 - ρ_Spearman(Ta, Tb). Hierarchical agglomerative clustering was executed using average linkage (hclust(as.dist(D), method = 'average')). The resulting dendrogram branch topologies were preserved to structure heatmap rows, while individual matrix cells were rendered as clean, high-contrast color blocks with English anatomical labels.</w:t>
-      </w:r>
-    </w:p>
-    <w:p>
-      <w:pPr>
-        <w:keepNext/>
-        <w:spacing w:before="280" w:after="80"/>
-      </w:pPr>
-      <w:r>
-        <w:rPr>
-          <w:rFonts w:ascii="Arial" w:hAnsi="Arial"/>
-          <w:b/>
-          <w:color w:val="1F4E78"/>
-          <w:sz w:val="25"/>
-        </w:rPr>
-        <w:t>9. Tissue-Stratified Linear-Scale Boxplots and One-Way ANOVA Modeling</w:t>
-      </w:r>
-    </w:p>
-    <w:p>
-      <w:pPr>
-        <w:spacing w:line="300" w:lineRule="auto" w:before="0" w:after="100"/>
-      </w:pPr>
-      <w:r>
-        <w:rPr>
-          <w:rFonts w:ascii="Calibri" w:hAnsi="Calibri"/>
-          <w:b/>
-          <w:color w:val="262626"/>
-          <w:sz w:val="21"/>
-        </w:rPr>
-        <w:t xml:space="preserve">Marker Gene Selection and Immutable Identifier Registry: </w:t>
-      </w:r>
-      <w:r>
-        <w:rPr>
-          <w:rFonts w:ascii="Calibri" w:hAnsi="Calibri"/>
-          <w:color w:val="262626"/>
-          <w:sz w:val="21"/>
-        </w:rPr>
-        <w:t>To evaluate physiological baseline expression and organ-level heterogeneity across the mammalian DNA repair machinery, 26 key biological marker genes across all seven canonical pathways were selected based on mechanistic centrality and manuscript narrative:</w:t>
-        <w:br/>
-        <w:t>• Nucleotide Excision Repair (NER, 7 genes): Xpc (ENSMUSG00000030094), Rad23b (ENSMUSG00000028426), Cetn2 (ENSMUSG00000031347), Ddb1 (ENSMUSG00000024740), Ddb2 (ENSMUSG00000002109), Ercc6 (ENSMUSG00000054051), Ercc8 (ENSMUSG00000021694).</w:t>
-        <w:br/>
-        <w:t>• Homologous Recombination (HR, 4 genes): Brca1 (ENSMUSG00000017146), Bard1 (ENSMUSG00000026196), Blm (ENSMUSG00000030528), Rad51 (ENSMUSG00000027323).</w:t>
-        <w:br/>
-        <w:t>• Non-Homologous End Joining (NHEJ, 4 genes): Nhej1 / XLF (ENSMUSG00000026162), Paxx (ENSMUSG00000047617), Xrcc6 / Ku70 (ENSMUSG00000022471), Xrcc5 / Ku80 (ENSMUSG00000026187).</w:t>
-        <w:br/>
-        <w:t>• Alternative End Joining (A-EJ, 4 genes): Parp1 (ENSMUSG00000026496), Polq (ENSMUSG00000034206), Lig1 (ENSMUSG00000056394), Lig3 (ENSMUSG00000020697).</w:t>
-        <w:br/>
-        <w:t>• Base Excision Repair (BER, 3 genes): Ung (ENSMUSG00000029591), Ogg1 (ENSMUSG00000030271), Neil1 (ENSMUSG00000032298).</w:t>
-        <w:br/>
-        <w:t>• Mismatch Repair (MMR, 2 genes): Msh2 (ENSMUSG00000024151), Msh3 (ENSMUSG00000014850).</w:t>
-        <w:br/>
-        <w:t>• Fanconi Anemia (FA, 2 genes): Fancd2 (ENSMUSG00000034023), Fanci (ENSMUSG00000039187).</w:t>
-      </w:r>
-    </w:p>
-    <w:p>
-      <w:pPr>
-        <w:spacing w:line="300" w:lineRule="auto" w:before="0" w:after="100"/>
-      </w:pPr>
-      <w:r>
-        <w:rPr>
-          <w:rFonts w:ascii="Calibri" w:hAnsi="Calibri"/>
-          <w:b/>
-          <w:color w:val="262626"/>
-          <w:sz w:val="21"/>
-        </w:rPr>
-        <w:t xml:space="preserve">Linear Boxplot Structural Specifications: </w:t>
-      </w:r>
-      <w:r>
-        <w:rPr>
-          <w:rFonts w:ascii="Calibri" w:hAnsi="Calibri"/>
-          <w:color w:val="262626"/>
-          <w:sz w:val="21"/>
-        </w:rPr>
-        <w:t>Individual flight mice biospecimens (n = 360) were stratified across 26 canonical tissues (arranged along the horizontal axis in canonical DDR rank order). Linear expression values were derived as Expression_linear = 2^(YARNNormalizedLog2) - 1.</w:t>
-        <w:br/>
-        <w:t>• Boxplot Geometry: The lower hinge indicates the first quartile (Q1, 25%); the center solid line represents the sample mean (μ); the upper hinge indicates the third quartile (Q3, 75%). Whiskers extend to the furthest observations within 1.5 × IQR from the hinges.</w:t>
-        <w:br/>
-        <w:t>• Individual Biospecimen Scatter: All 360 individual flight mice were overlaid as jittered points using position_jitterdodge (dodge.width = 0.80, jitter.width = 0.11, seed = 25).</w:t>
-        <w:br/>
-        <w:t>• Cross-Tissue Mean Trajectories: Dashed lines connect tissue-level mean values for each gene to illustrate organ-specific expression gradients.</w:t>
-        <w:br/>
-        <w:t>• NER Subcomplex Color and Shape Coding: NER recognition complexes were disambiguated via paired color-and-shape glyphs: XPC/RAD23B/CETN2 (amber; cross ✕, triangle ▲, circle ●); DDB1/DDB2 (teal; cross ✕, triangle ▲); and ERCC6/ERCC8 (blue; cross ✕, triangle ▲).</w:t>
-      </w:r>
-    </w:p>
-    <w:p>
-      <w:pPr>
-        <w:spacing w:line="300" w:lineRule="auto" w:before="0" w:after="100"/>
-      </w:pPr>
-      <w:r>
-        <w:rPr>
-          <w:rFonts w:ascii="Calibri" w:hAnsi="Calibri"/>
-          <w:b/>
-          <w:color w:val="262626"/>
-          <w:sz w:val="21"/>
-        </w:rPr>
-        <w:t xml:space="preserve">One-Way ANOVA Statistical Modeling: </w:t>
-      </w:r>
-      <w:r>
-        <w:rPr>
-          <w:rFonts w:ascii="Calibri" w:hAnsi="Calibri"/>
-          <w:color w:val="262626"/>
-          <w:sz w:val="21"/>
-        </w:rPr>
-        <w:t>Tissue-dependent expression heterogeneity was formally evaluated using ordinary One-way Analysis of Variance (ANOVA):</w:t>
-        <w:br/>
-        <w:t>1. Gene-Level One-Way ANOVA: Evaluated cross-tissue variation for each gene independently:</w:t>
-        <w:br/>
-        <w:t xml:space="preserve">        y_ijk = μ + α_j + ε_ijk,    ε_ijk ~ N(0, σ^2)</w:t>
-        <w:br/>
-        <w:t>yielding between-group degrees of freedom df_group = 25 and residual degrees of freedom df_residual = 334 (or 330 for FA), with exact F-statistics and scientific-notation P-values printed directly in figure subtitles.</w:t>
-        <w:br/>
-        <w:t>2. Pathway-Level One-Way ANOVA: Evaluated composite pathway heterogeneity by modeling the per-mouse mean pathway expression:</w:t>
-        <w:br/>
-        <w:t xml:space="preserve">        ȳ_ik = (1 / G) ∑_{g=1}^G y_igk</w:t>
-        <w:br/>
-        <w:t>testing overall pathway abundance divergence across the 26 tissues. Exact F-statistics and P-values are reported in subtitles and audited in comprehensive CSV summary tables (01_pathway_one_way_anova_linear_summary.csv, 02_gene_one_way_anova_linear_summary.csv).</w:t>
-      </w:r>
-    </w:p>
-    <w:p>
-      <w:pPr>
-        <w:keepNext/>
-        <w:spacing w:before="280" w:after="80"/>
-      </w:pPr>
-      <w:r>
-        <w:rPr>
-          <w:rFonts w:ascii="Arial" w:hAnsi="Arial"/>
-          <w:b/>
-          <w:color w:val="1F4E78"/>
-          <w:sz w:val="25"/>
-        </w:rPr>
-        <w:t>10. Computational Environment, Code Governance, and Reproducibility</w:t>
-      </w:r>
-    </w:p>
-    <w:p>
-      <w:pPr>
-        <w:spacing w:line="300" w:lineRule="auto" w:before="0" w:after="100"/>
-      </w:pPr>
-      <w:r>
-        <w:rPr>
-          <w:rFonts w:ascii="Calibri" w:hAnsi="Calibri"/>
-          <w:b/>
-          <w:color w:val="262626"/>
-          <w:sz w:val="21"/>
+          <w:sz w:val="20"/>
         </w:rPr>
         <w:t xml:space="preserve">Software Architecture: </w:t>
       </w:r>
@@ -845,21 +735,21 @@
         <w:rPr>
           <w:rFonts w:ascii="Calibri" w:hAnsi="Calibri"/>
           <w:color w:val="262626"/>
-          <w:sz w:val="21"/>
+          <w:sz w:val="20"/>
         </w:rPr>
         <w:t>All statistical modeling, data transformations, and figure generation were executed in R (version 4.4.3) and Python (version 3.13). Core R dependencies included data.table (v1.16.4), ggplot2 (v3.5.1), patchwork (v1.3.0), scales (v1.3.0), and ggVennDiagram (v1.5.2), managed via renv.lock. Python workflows utilized matplotlib (v3.10.0), pandas (v2.2.3), and numpy (v2.2.3).</w:t>
       </w:r>
     </w:p>
     <w:p>
       <w:pPr>
-        <w:spacing w:line="300" w:lineRule="auto" w:before="0" w:after="100"/>
+        <w:spacing w:line="293" w:lineRule="auto" w:before="0" w:after="90"/>
       </w:pPr>
       <w:r>
         <w:rPr>
           <w:rFonts w:ascii="Calibri" w:hAnsi="Calibri"/>
           <w:b/>
           <w:color w:val="262626"/>
-          <w:sz w:val="21"/>
+          <w:sz w:val="20"/>
         </w:rPr>
         <w:t xml:space="preserve">Seed Locking and Version Control: </w:t>
       </w:r>
@@ -867,7 +757,7 @@
         <w:rPr>
           <w:rFonts w:ascii="Calibri" w:hAnsi="Calibri"/>
           <w:color w:val="262626"/>
-          <w:sz w:val="21"/>
+          <w:sz w:val="20"/>
         </w:rPr>
         <w:t>All stochastic operations, point jittering, and permutation tests were locked to random seed 25. Complete analytical workflows, scripts, and data matrices are version-controlled via GitHub (git). All released figure panels, data tables, and input manifests were independently audited and locked with cryptographic SHA-256 checksums (provenance/reference_sha256.csv), ensuring 100% deterministic reproducibility.</w:t>
       </w:r>
@@ -882,21 +772,21 @@
           <w:rFonts w:ascii="Arial" w:hAnsi="Arial"/>
           <w:b/>
           <w:color w:val="1F4E78"/>
-          <w:sz w:val="25"/>
+          <w:sz w:val="24"/>
         </w:rPr>
-        <w:t>11. Production Figure and Analytical Workflow Reference Matrix</w:t>
+        <w:t>9. Production Figure and Analytical Workflow Cross-Reference Matrix</w:t>
       </w:r>
     </w:p>
     <w:p>
       <w:pPr>
-        <w:spacing w:line="300" w:lineRule="auto" w:before="0" w:after="100"/>
+        <w:spacing w:line="293" w:lineRule="auto" w:before="0" w:after="90"/>
       </w:pPr>
       <w:r>
         <w:rPr>
           <w:rFonts w:ascii="Calibri" w:hAnsi="Calibri"/>
           <w:b/>
           <w:color w:val="262626"/>
-          <w:sz w:val="21"/>
+          <w:sz w:val="20"/>
         </w:rPr>
         <w:t xml:space="preserve">Provenance Cross-Reference: </w:t>
       </w:r>
@@ -904,9 +794,9 @@
         <w:rPr>
           <w:rFonts w:ascii="Calibri" w:hAnsi="Calibri"/>
           <w:color w:val="262626"/>
-          <w:sz w:val="21"/>
+          <w:sz w:val="20"/>
         </w:rPr>
-        <w:t>The following audited reference matrix connects every publication figure and statistical table to its underlying mathematical model, sample scope, and analytical script:</w:t>
+        <w:t>The following audited reference matrix connects every publication figure and statistical table in sequential order to its underlying mathematical model, sample scope, and analytical script:</w:t>
       </w:r>
     </w:p>
     <w:tbl>
@@ -946,8 +836,8 @@
             <w:tcMar>
               <w:top w:w="100" w:type="dxa"/>
               <w:bottom w:w="100" w:type="dxa"/>
-              <w:left w:w="80" w:type="dxa"/>
-              <w:right w:w="80" w:type="dxa"/>
+              <w:left w:w="70" w:type="dxa"/>
+              <w:right w:w="70" w:type="dxa"/>
             </w:tcMar>
           </w:tcPr>
           <w:p>
@@ -976,8 +866,8 @@
             <w:tcMar>
               <w:top w:w="100" w:type="dxa"/>
               <w:bottom w:w="100" w:type="dxa"/>
-              <w:left w:w="80" w:type="dxa"/>
-              <w:right w:w="80" w:type="dxa"/>
+              <w:left w:w="70" w:type="dxa"/>
+              <w:right w:w="70" w:type="dxa"/>
             </w:tcMar>
           </w:tcPr>
           <w:p>
@@ -1006,8 +896,8 @@
             <w:tcMar>
               <w:top w:w="100" w:type="dxa"/>
               <w:bottom w:w="100" w:type="dxa"/>
-              <w:left w:w="80" w:type="dxa"/>
-              <w:right w:w="80" w:type="dxa"/>
+              <w:left w:w="70" w:type="dxa"/>
+              <w:right w:w="70" w:type="dxa"/>
             </w:tcMar>
           </w:tcPr>
           <w:p>
@@ -1036,8 +926,8 @@
             <w:tcMar>
               <w:top w:w="100" w:type="dxa"/>
               <w:bottom w:w="100" w:type="dxa"/>
-              <w:left w:w="80" w:type="dxa"/>
-              <w:right w:w="80" w:type="dxa"/>
+              <w:left w:w="70" w:type="dxa"/>
+              <w:right w:w="70" w:type="dxa"/>
             </w:tcMar>
           </w:tcPr>
           <w:p>
@@ -1066,8 +956,8 @@
             <w:tcMar>
               <w:top w:w="100" w:type="dxa"/>
               <w:bottom w:w="100" w:type="dxa"/>
-              <w:left w:w="80" w:type="dxa"/>
-              <w:right w:w="80" w:type="dxa"/>
+              <w:left w:w="70" w:type="dxa"/>
+              <w:right w:w="70" w:type="dxa"/>
             </w:tcMar>
           </w:tcPr>
           <w:p>
@@ -1094,10 +984,10 @@
             <w:vAlign w:val="center"/>
             <w:shd w:fill="FAFCFD"/>
             <w:tcMar>
-              <w:top w:w="60" w:type="dxa"/>
-              <w:bottom w:w="60" w:type="dxa"/>
-              <w:left w:w="80" w:type="dxa"/>
-              <w:right w:w="80" w:type="dxa"/>
+              <w:top w:w="55" w:type="dxa"/>
+              <w:bottom w:w="55" w:type="dxa"/>
+              <w:left w:w="70" w:type="dxa"/>
+              <w:right w:w="70" w:type="dxa"/>
             </w:tcMar>
           </w:tcPr>
           <w:p>
@@ -1120,10 +1010,10 @@
             <w:vAlign w:val="center"/>
             <w:shd w:fill="FAFCFD"/>
             <w:tcMar>
-              <w:top w:w="60" w:type="dxa"/>
-              <w:bottom w:w="60" w:type="dxa"/>
-              <w:left w:w="80" w:type="dxa"/>
-              <w:right w:w="80" w:type="dxa"/>
+              <w:top w:w="55" w:type="dxa"/>
+              <w:bottom w:w="55" w:type="dxa"/>
+              <w:left w:w="70" w:type="dxa"/>
+              <w:right w:w="70" w:type="dxa"/>
             </w:tcMar>
           </w:tcPr>
           <w:p>
@@ -1146,10 +1036,10 @@
             <w:vAlign w:val="center"/>
             <w:shd w:fill="FAFCFD"/>
             <w:tcMar>
-              <w:top w:w="60" w:type="dxa"/>
-              <w:bottom w:w="60" w:type="dxa"/>
-              <w:left w:w="80" w:type="dxa"/>
-              <w:right w:w="80" w:type="dxa"/>
+              <w:top w:w="55" w:type="dxa"/>
+              <w:bottom w:w="55" w:type="dxa"/>
+              <w:left w:w="70" w:type="dxa"/>
+              <w:right w:w="70" w:type="dxa"/>
             </w:tcMar>
           </w:tcPr>
           <w:p>
@@ -1172,10 +1062,10 @@
             <w:vAlign w:val="center"/>
             <w:shd w:fill="FAFCFD"/>
             <w:tcMar>
-              <w:top w:w="60" w:type="dxa"/>
-              <w:bottom w:w="60" w:type="dxa"/>
-              <w:left w:w="80" w:type="dxa"/>
-              <w:right w:w="80" w:type="dxa"/>
+              <w:top w:w="55" w:type="dxa"/>
+              <w:bottom w:w="55" w:type="dxa"/>
+              <w:left w:w="70" w:type="dxa"/>
+              <w:right w:w="70" w:type="dxa"/>
             </w:tcMar>
           </w:tcPr>
           <w:p>
@@ -1198,10 +1088,10 @@
             <w:vAlign w:val="center"/>
             <w:shd w:fill="FAFCFD"/>
             <w:tcMar>
-              <w:top w:w="60" w:type="dxa"/>
-              <w:bottom w:w="60" w:type="dxa"/>
-              <w:left w:w="80" w:type="dxa"/>
-              <w:right w:w="80" w:type="dxa"/>
+              <w:top w:w="55" w:type="dxa"/>
+              <w:bottom w:w="55" w:type="dxa"/>
+              <w:left w:w="70" w:type="dxa"/>
+              <w:right w:w="70" w:type="dxa"/>
             </w:tcMar>
           </w:tcPr>
           <w:p>
@@ -1226,10 +1116,10 @@
             <w:tcW w:type="dxa" w:w="1728"/>
             <w:vAlign w:val="center"/>
             <w:tcMar>
-              <w:top w:w="60" w:type="dxa"/>
-              <w:bottom w:w="60" w:type="dxa"/>
-              <w:left w:w="80" w:type="dxa"/>
-              <w:right w:w="80" w:type="dxa"/>
+              <w:top w:w="55" w:type="dxa"/>
+              <w:bottom w:w="55" w:type="dxa"/>
+              <w:left w:w="70" w:type="dxa"/>
+              <w:right w:w="70" w:type="dxa"/>
             </w:tcMar>
           </w:tcPr>
           <w:p>
@@ -1251,10 +1141,10 @@
             <w:tcW w:type="dxa" w:w="1872"/>
             <w:vAlign w:val="center"/>
             <w:tcMar>
-              <w:top w:w="60" w:type="dxa"/>
-              <w:bottom w:w="60" w:type="dxa"/>
-              <w:left w:w="80" w:type="dxa"/>
-              <w:right w:w="80" w:type="dxa"/>
+              <w:top w:w="55" w:type="dxa"/>
+              <w:bottom w:w="55" w:type="dxa"/>
+              <w:left w:w="70" w:type="dxa"/>
+              <w:right w:w="70" w:type="dxa"/>
             </w:tcMar>
           </w:tcPr>
           <w:p>
@@ -1276,10 +1166,10 @@
             <w:tcW w:type="dxa" w:w="1872"/>
             <w:vAlign w:val="center"/>
             <w:tcMar>
-              <w:top w:w="60" w:type="dxa"/>
-              <w:bottom w:w="60" w:type="dxa"/>
-              <w:left w:w="80" w:type="dxa"/>
-              <w:right w:w="80" w:type="dxa"/>
+              <w:top w:w="55" w:type="dxa"/>
+              <w:bottom w:w="55" w:type="dxa"/>
+              <w:left w:w="70" w:type="dxa"/>
+              <w:right w:w="70" w:type="dxa"/>
             </w:tcMar>
           </w:tcPr>
           <w:p>
@@ -1301,10 +1191,10 @@
             <w:tcW w:type="dxa" w:w="2160"/>
             <w:vAlign w:val="center"/>
             <w:tcMar>
-              <w:top w:w="60" w:type="dxa"/>
-              <w:bottom w:w="60" w:type="dxa"/>
-              <w:left w:w="80" w:type="dxa"/>
-              <w:right w:w="80" w:type="dxa"/>
+              <w:top w:w="55" w:type="dxa"/>
+              <w:bottom w:w="55" w:type="dxa"/>
+              <w:left w:w="70" w:type="dxa"/>
+              <w:right w:w="70" w:type="dxa"/>
             </w:tcMar>
           </w:tcPr>
           <w:p>
@@ -1326,10 +1216,10 @@
             <w:tcW w:type="dxa" w:w="1728"/>
             <w:vAlign w:val="center"/>
             <w:tcMar>
-              <w:top w:w="60" w:type="dxa"/>
-              <w:bottom w:w="60" w:type="dxa"/>
-              <w:left w:w="80" w:type="dxa"/>
-              <w:right w:w="80" w:type="dxa"/>
+              <w:top w:w="55" w:type="dxa"/>
+              <w:bottom w:w="55" w:type="dxa"/>
+              <w:left w:w="70" w:type="dxa"/>
+              <w:right w:w="70" w:type="dxa"/>
             </w:tcMar>
           </w:tcPr>
           <w:p>
@@ -1355,10 +1245,10 @@
             <w:vAlign w:val="center"/>
             <w:shd w:fill="FAFCFD"/>
             <w:tcMar>
-              <w:top w:w="60" w:type="dxa"/>
-              <w:bottom w:w="60" w:type="dxa"/>
-              <w:left w:w="80" w:type="dxa"/>
-              <w:right w:w="80" w:type="dxa"/>
+              <w:top w:w="55" w:type="dxa"/>
+              <w:bottom w:w="55" w:type="dxa"/>
+              <w:left w:w="70" w:type="dxa"/>
+              <w:right w:w="70" w:type="dxa"/>
             </w:tcMar>
           </w:tcPr>
           <w:p>
@@ -1381,10 +1271,10 @@
             <w:vAlign w:val="center"/>
             <w:shd w:fill="FAFCFD"/>
             <w:tcMar>
-              <w:top w:w="60" w:type="dxa"/>
-              <w:bottom w:w="60" w:type="dxa"/>
-              <w:left w:w="80" w:type="dxa"/>
-              <w:right w:w="80" w:type="dxa"/>
+              <w:top w:w="55" w:type="dxa"/>
+              <w:bottom w:w="55" w:type="dxa"/>
+              <w:left w:w="70" w:type="dxa"/>
+              <w:right w:w="70" w:type="dxa"/>
             </w:tcMar>
           </w:tcPr>
           <w:p>
@@ -1407,10 +1297,10 @@
             <w:vAlign w:val="center"/>
             <w:shd w:fill="FAFCFD"/>
             <w:tcMar>
-              <w:top w:w="60" w:type="dxa"/>
-              <w:bottom w:w="60" w:type="dxa"/>
-              <w:left w:w="80" w:type="dxa"/>
-              <w:right w:w="80" w:type="dxa"/>
+              <w:top w:w="55" w:type="dxa"/>
+              <w:bottom w:w="55" w:type="dxa"/>
+              <w:left w:w="70" w:type="dxa"/>
+              <w:right w:w="70" w:type="dxa"/>
             </w:tcMar>
           </w:tcPr>
           <w:p>
@@ -1433,10 +1323,10 @@
             <w:vAlign w:val="center"/>
             <w:shd w:fill="FAFCFD"/>
             <w:tcMar>
-              <w:top w:w="60" w:type="dxa"/>
-              <w:bottom w:w="60" w:type="dxa"/>
-              <w:left w:w="80" w:type="dxa"/>
-              <w:right w:w="80" w:type="dxa"/>
+              <w:top w:w="55" w:type="dxa"/>
+              <w:bottom w:w="55" w:type="dxa"/>
+              <w:left w:w="70" w:type="dxa"/>
+              <w:right w:w="70" w:type="dxa"/>
             </w:tcMar>
           </w:tcPr>
           <w:p>
@@ -1459,10 +1349,10 @@
             <w:vAlign w:val="center"/>
             <w:shd w:fill="FAFCFD"/>
             <w:tcMar>
-              <w:top w:w="60" w:type="dxa"/>
-              <w:bottom w:w="60" w:type="dxa"/>
-              <w:left w:w="80" w:type="dxa"/>
-              <w:right w:w="80" w:type="dxa"/>
+              <w:top w:w="55" w:type="dxa"/>
+              <w:bottom w:w="55" w:type="dxa"/>
+              <w:left w:w="70" w:type="dxa"/>
+              <w:right w:w="70" w:type="dxa"/>
             </w:tcMar>
           </w:tcPr>
           <w:p>
@@ -1487,10 +1377,10 @@
             <w:tcW w:type="dxa" w:w="1728"/>
             <w:vAlign w:val="center"/>
             <w:tcMar>
-              <w:top w:w="60" w:type="dxa"/>
-              <w:bottom w:w="60" w:type="dxa"/>
-              <w:left w:w="80" w:type="dxa"/>
-              <w:right w:w="80" w:type="dxa"/>
+              <w:top w:w="55" w:type="dxa"/>
+              <w:bottom w:w="55" w:type="dxa"/>
+              <w:left w:w="70" w:type="dxa"/>
+              <w:right w:w="70" w:type="dxa"/>
             </w:tcMar>
           </w:tcPr>
           <w:p>
@@ -1503,7 +1393,7 @@
                 <w:color w:val="262626"/>
                 <w:sz w:val="16"/>
               </w:rPr>
-              <w:t>Fig. 3a / S2a</w:t>
+              <w:t>Fig. 3a</w:t>
             </w:r>
           </w:p>
         </w:tc>
@@ -1512,10 +1402,10 @@
             <w:tcW w:type="dxa" w:w="1872"/>
             <w:vAlign w:val="center"/>
             <w:tcMar>
-              <w:top w:w="60" w:type="dxa"/>
-              <w:bottom w:w="60" w:type="dxa"/>
-              <w:left w:w="80" w:type="dxa"/>
-              <w:right w:w="80" w:type="dxa"/>
+              <w:top w:w="55" w:type="dxa"/>
+              <w:bottom w:w="55" w:type="dxa"/>
+              <w:left w:w="70" w:type="dxa"/>
+              <w:right w:w="70" w:type="dxa"/>
             </w:tcMar>
           </w:tcPr>
           <w:p>
@@ -1528,7 +1418,7 @@
                 <w:color w:val="262626"/>
                 <w:sz w:val="16"/>
               </w:rPr>
-              <w:t>Tissue Repertoire Overlap</w:t>
+              <w:t>Thymus Repertoire Overlap</w:t>
             </w:r>
           </w:p>
         </w:tc>
@@ -1537,10 +1427,10 @@
             <w:tcW w:type="dxa" w:w="1872"/>
             <w:vAlign w:val="center"/>
             <w:tcMar>
-              <w:top w:w="60" w:type="dxa"/>
-              <w:bottom w:w="60" w:type="dxa"/>
-              <w:left w:w="80" w:type="dxa"/>
-              <w:right w:w="80" w:type="dxa"/>
+              <w:top w:w="55" w:type="dxa"/>
+              <w:bottom w:w="55" w:type="dxa"/>
+              <w:left w:w="70" w:type="dxa"/>
+              <w:right w:w="70" w:type="dxa"/>
             </w:tcMar>
           </w:tcPr>
           <w:p>
@@ -1553,7 +1443,7 @@
                 <w:color w:val="262626"/>
                 <w:sz w:val="16"/>
               </w:rPr>
-              <w:t>Thymus (4 comp.) / Kidney (5 OSD)</w:t>
+              <w:t>Thymus (4 flight comparisons)</w:t>
             </w:r>
           </w:p>
         </w:tc>
@@ -1562,10 +1452,10 @@
             <w:tcW w:type="dxa" w:w="2160"/>
             <w:vAlign w:val="center"/>
             <w:tcMar>
-              <w:top w:w="60" w:type="dxa"/>
-              <w:bottom w:w="60" w:type="dxa"/>
-              <w:left w:w="80" w:type="dxa"/>
-              <w:right w:w="80" w:type="dxa"/>
+              <w:top w:w="55" w:type="dxa"/>
+              <w:bottom w:w="55" w:type="dxa"/>
+              <w:left w:w="70" w:type="dxa"/>
+              <w:right w:w="70" w:type="dxa"/>
             </w:tcMar>
           </w:tcPr>
           <w:p>
@@ -1587,10 +1477,10 @@
             <w:tcW w:type="dxa" w:w="1728"/>
             <w:vAlign w:val="center"/>
             <w:tcMar>
-              <w:top w:w="60" w:type="dxa"/>
-              <w:bottom w:w="60" w:type="dxa"/>
-              <w:left w:w="80" w:type="dxa"/>
-              <w:right w:w="80" w:type="dxa"/>
+              <w:top w:w="55" w:type="dxa"/>
+              <w:bottom w:w="55" w:type="dxa"/>
+              <w:left w:w="70" w:type="dxa"/>
+              <w:right w:w="70" w:type="dxa"/>
             </w:tcMar>
           </w:tcPr>
           <w:p>
@@ -1616,10 +1506,10 @@
             <w:vAlign w:val="center"/>
             <w:shd w:fill="FAFCFD"/>
             <w:tcMar>
-              <w:top w:w="60" w:type="dxa"/>
-              <w:bottom w:w="60" w:type="dxa"/>
-              <w:left w:w="80" w:type="dxa"/>
-              <w:right w:w="80" w:type="dxa"/>
+              <w:top w:w="55" w:type="dxa"/>
+              <w:bottom w:w="55" w:type="dxa"/>
+              <w:left w:w="70" w:type="dxa"/>
+              <w:right w:w="70" w:type="dxa"/>
             </w:tcMar>
           </w:tcPr>
           <w:p>
@@ -1632,7 +1522,7 @@
                 <w:color w:val="262626"/>
                 <w:sz w:val="16"/>
               </w:rPr>
-              <w:t>Fig. 3b / S2b</w:t>
+              <w:t>Fig. 3b</w:t>
             </w:r>
           </w:p>
         </w:tc>
@@ -1642,10 +1532,10 @@
             <w:vAlign w:val="center"/>
             <w:shd w:fill="FAFCFD"/>
             <w:tcMar>
-              <w:top w:w="60" w:type="dxa"/>
-              <w:bottom w:w="60" w:type="dxa"/>
-              <w:left w:w="80" w:type="dxa"/>
-              <w:right w:w="80" w:type="dxa"/>
+              <w:top w:w="55" w:type="dxa"/>
+              <w:bottom w:w="55" w:type="dxa"/>
+              <w:left w:w="70" w:type="dxa"/>
+              <w:right w:w="70" w:type="dxa"/>
             </w:tcMar>
           </w:tcPr>
           <w:p>
@@ -1658,7 +1548,7 @@
                 <w:color w:val="262626"/>
                 <w:sz w:val="16"/>
               </w:rPr>
-              <w:t>Common-Direction DEGs</w:t>
+              <w:t>Thymus Common-Direction DEGs</w:t>
             </w:r>
           </w:p>
         </w:tc>
@@ -1668,10 +1558,10 @@
             <w:vAlign w:val="center"/>
             <w:shd w:fill="FAFCFD"/>
             <w:tcMar>
-              <w:top w:w="60" w:type="dxa"/>
-              <w:bottom w:w="60" w:type="dxa"/>
-              <w:left w:w="80" w:type="dxa"/>
-              <w:right w:w="80" w:type="dxa"/>
+              <w:top w:w="55" w:type="dxa"/>
+              <w:bottom w:w="55" w:type="dxa"/>
+              <w:left w:w="70" w:type="dxa"/>
+              <w:right w:w="70" w:type="dxa"/>
             </w:tcMar>
           </w:tcPr>
           <w:p>
@@ -1684,7 +1574,7 @@
                 <w:color w:val="262626"/>
                 <w:sz w:val="16"/>
               </w:rPr>
-              <w:t>Thymus / Kidney flight comparisons</w:t>
+              <w:t>Thymus (4 flight comparisons)</w:t>
             </w:r>
           </w:p>
         </w:tc>
@@ -1694,10 +1584,10 @@
             <w:vAlign w:val="center"/>
             <w:shd w:fill="FAFCFD"/>
             <w:tcMar>
-              <w:top w:w="60" w:type="dxa"/>
-              <w:bottom w:w="60" w:type="dxa"/>
-              <w:left w:w="80" w:type="dxa"/>
-              <w:right w:w="80" w:type="dxa"/>
+              <w:top w:w="55" w:type="dxa"/>
+              <w:bottom w:w="55" w:type="dxa"/>
+              <w:left w:w="70" w:type="dxa"/>
+              <w:right w:w="70" w:type="dxa"/>
             </w:tcMar>
           </w:tcPr>
           <w:p>
@@ -1720,10 +1610,10 @@
             <w:vAlign w:val="center"/>
             <w:shd w:fill="FAFCFD"/>
             <w:tcMar>
-              <w:top w:w="60" w:type="dxa"/>
-              <w:bottom w:w="60" w:type="dxa"/>
-              <w:left w:w="80" w:type="dxa"/>
-              <w:right w:w="80" w:type="dxa"/>
+              <w:top w:w="55" w:type="dxa"/>
+              <w:bottom w:w="55" w:type="dxa"/>
+              <w:left w:w="70" w:type="dxa"/>
+              <w:right w:w="70" w:type="dxa"/>
             </w:tcMar>
           </w:tcPr>
           <w:p>
@@ -1748,10 +1638,10 @@
             <w:tcW w:type="dxa" w:w="1728"/>
             <w:vAlign w:val="center"/>
             <w:tcMar>
-              <w:top w:w="60" w:type="dxa"/>
-              <w:bottom w:w="60" w:type="dxa"/>
-              <w:left w:w="80" w:type="dxa"/>
-              <w:right w:w="80" w:type="dxa"/>
+              <w:top w:w="55" w:type="dxa"/>
+              <w:bottom w:w="55" w:type="dxa"/>
+              <w:left w:w="70" w:type="dxa"/>
+              <w:right w:w="70" w:type="dxa"/>
             </w:tcMar>
           </w:tcPr>
           <w:p>
@@ -1764,7 +1654,7 @@
                 <w:color w:val="262626"/>
                 <w:sz w:val="16"/>
               </w:rPr>
-              <w:t>Fig. 4a / 5a</w:t>
+              <w:t>Fig. 4a</w:t>
             </w:r>
           </w:p>
         </w:tc>
@@ -1773,10 +1663,10 @@
             <w:tcW w:type="dxa" w:w="1872"/>
             <w:vAlign w:val="center"/>
             <w:tcMar>
-              <w:top w:w="60" w:type="dxa"/>
-              <w:bottom w:w="60" w:type="dxa"/>
-              <w:left w:w="80" w:type="dxa"/>
-              <w:right w:w="80" w:type="dxa"/>
+              <w:top w:w="55" w:type="dxa"/>
+              <w:bottom w:w="55" w:type="dxa"/>
+              <w:left w:w="70" w:type="dxa"/>
+              <w:right w:w="70" w:type="dxa"/>
             </w:tcMar>
           </w:tcPr>
           <w:p>
@@ -1789,7 +1679,7 @@
                 <w:color w:val="262626"/>
                 <w:sz w:val="16"/>
               </w:rPr>
-              <w:t>Repair Baseline Clustering</w:t>
+              <w:t>DSB Baseline Clustering</w:t>
             </w:r>
           </w:p>
         </w:tc>
@@ -1798,10 +1688,10 @@
             <w:tcW w:type="dxa" w:w="1872"/>
             <w:vAlign w:val="center"/>
             <w:tcMar>
-              <w:top w:w="60" w:type="dxa"/>
-              <w:bottom w:w="60" w:type="dxa"/>
-              <w:left w:w="80" w:type="dxa"/>
-              <w:right w:w="80" w:type="dxa"/>
+              <w:top w:w="55" w:type="dxa"/>
+              <w:bottom w:w="55" w:type="dxa"/>
+              <w:left w:w="70" w:type="dxa"/>
+              <w:right w:w="70" w:type="dxa"/>
             </w:tcMar>
           </w:tcPr>
           <w:p>
@@ -1814,7 +1704,7 @@
                 <w:color w:val="262626"/>
                 <w:sz w:val="16"/>
               </w:rPr>
-              <w:t>26 tissues, 74 components (DSB 29, SSB 45)</w:t>
+              <w:t>26 tissues, 29 DSB components</w:t>
             </w:r>
           </w:p>
         </w:tc>
@@ -1823,10 +1713,10 @@
             <w:tcW w:type="dxa" w:w="2160"/>
             <w:vAlign w:val="center"/>
             <w:tcMar>
-              <w:top w:w="60" w:type="dxa"/>
-              <w:bottom w:w="60" w:type="dxa"/>
-              <w:left w:w="80" w:type="dxa"/>
-              <w:right w:w="80" w:type="dxa"/>
+              <w:top w:w="55" w:type="dxa"/>
+              <w:bottom w:w="55" w:type="dxa"/>
+              <w:left w:w="70" w:type="dxa"/>
+              <w:right w:w="70" w:type="dxa"/>
             </w:tcMar>
           </w:tcPr>
           <w:p>
@@ -1848,10 +1738,10 @@
             <w:tcW w:type="dxa" w:w="1728"/>
             <w:vAlign w:val="center"/>
             <w:tcMar>
-              <w:top w:w="60" w:type="dxa"/>
-              <w:bottom w:w="60" w:type="dxa"/>
-              <w:left w:w="80" w:type="dxa"/>
-              <w:right w:w="80" w:type="dxa"/>
+              <w:top w:w="55" w:type="dxa"/>
+              <w:bottom w:w="55" w:type="dxa"/>
+              <w:left w:w="70" w:type="dxa"/>
+              <w:right w:w="70" w:type="dxa"/>
             </w:tcMar>
           </w:tcPr>
           <w:p>
@@ -1877,10 +1767,10 @@
             <w:vAlign w:val="center"/>
             <w:shd w:fill="FAFCFD"/>
             <w:tcMar>
-              <w:top w:w="60" w:type="dxa"/>
-              <w:bottom w:w="60" w:type="dxa"/>
-              <w:left w:w="80" w:type="dxa"/>
-              <w:right w:w="80" w:type="dxa"/>
+              <w:top w:w="55" w:type="dxa"/>
+              <w:bottom w:w="55" w:type="dxa"/>
+              <w:left w:w="70" w:type="dxa"/>
+              <w:right w:w="70" w:type="dxa"/>
             </w:tcMar>
           </w:tcPr>
           <w:p>
@@ -1893,7 +1783,7 @@
                 <w:color w:val="262626"/>
                 <w:sz w:val="16"/>
               </w:rPr>
-              <w:t>Fig. 4b / 5b</w:t>
+              <w:t>Fig. 4b</w:t>
             </w:r>
           </w:p>
         </w:tc>
@@ -1903,10 +1793,10 @@
             <w:vAlign w:val="center"/>
             <w:shd w:fill="FAFCFD"/>
             <w:tcMar>
-              <w:top w:w="60" w:type="dxa"/>
-              <w:bottom w:w="60" w:type="dxa"/>
-              <w:left w:w="80" w:type="dxa"/>
-              <w:right w:w="80" w:type="dxa"/>
+              <w:top w:w="55" w:type="dxa"/>
+              <w:bottom w:w="55" w:type="dxa"/>
+              <w:left w:w="70" w:type="dxa"/>
+              <w:right w:w="70" w:type="dxa"/>
             </w:tcMar>
           </w:tcPr>
           <w:p>
@@ -1919,7 +1809,7 @@
                 <w:color w:val="262626"/>
                 <w:sz w:val="16"/>
               </w:rPr>
-              <w:t>Spaceflight Meta-Analysis</w:t>
+              <w:t>NHEJ Linear Boxplot</w:t>
             </w:r>
           </w:p>
         </w:tc>
@@ -1929,10 +1819,10 @@
             <w:vAlign w:val="center"/>
             <w:shd w:fill="FAFCFD"/>
             <w:tcMar>
-              <w:top w:w="60" w:type="dxa"/>
-              <w:bottom w:w="60" w:type="dxa"/>
-              <w:left w:w="80" w:type="dxa"/>
-              <w:right w:w="80" w:type="dxa"/>
+              <w:top w:w="55" w:type="dxa"/>
+              <w:bottom w:w="55" w:type="dxa"/>
+              <w:left w:w="70" w:type="dxa"/>
+              <w:right w:w="70" w:type="dxa"/>
             </w:tcMar>
           </w:tcPr>
           <w:p>
@@ -1945,7 +1835,7 @@
                 <w:color w:val="262626"/>
                 <w:sz w:val="16"/>
               </w:rPr>
-              <w:t>26 tissues × core components</w:t>
+              <w:t>360 flight mice × 4 genes (26 tissues)</w:t>
             </w:r>
           </w:p>
         </w:tc>
@@ -1955,10 +1845,400 @@
             <w:vAlign w:val="center"/>
             <w:shd w:fill="FAFCFD"/>
             <w:tcMar>
-              <w:top w:w="60" w:type="dxa"/>
-              <w:bottom w:w="60" w:type="dxa"/>
-              <w:left w:w="80" w:type="dxa"/>
-              <w:right w:w="80" w:type="dxa"/>
+              <w:top w:w="55" w:type="dxa"/>
+              <w:bottom w:w="55" w:type="dxa"/>
+              <w:left w:w="70" w:type="dxa"/>
+              <w:right w:w="70" w:type="dxa"/>
+            </w:tcMar>
+          </w:tcPr>
+          <w:p>
+            <w:pPr>
+              <w:spacing w:line="276" w:lineRule="auto" w:before="0" w:after="0"/>
+            </w:pPr>
+            <w:r>
+              <w:rPr>
+                <w:rFonts w:ascii="Calibri" w:hAnsi="Calibri"/>
+                <w:color w:val="262626"/>
+                <w:sz w:val="16"/>
+              </w:rPr>
+              <w:t>Linear scale 2^log2 - 1, Mean hinge, Gene &amp; Pathway ANOVA</w:t>
+            </w:r>
+          </w:p>
+        </w:tc>
+        <w:tc>
+          <w:tcPr>
+            <w:tcW w:type="dxa" w:w="1728"/>
+            <w:vAlign w:val="center"/>
+            <w:shd w:fill="FAFCFD"/>
+            <w:tcMar>
+              <w:top w:w="55" w:type="dxa"/>
+              <w:bottom w:w="55" w:type="dxa"/>
+              <w:left w:w="70" w:type="dxa"/>
+              <w:right w:w="70" w:type="dxa"/>
+            </w:tcMar>
+          </w:tcPr>
+          <w:p>
+            <w:pPr>
+              <w:spacing w:line="276" w:lineRule="auto" w:before="0" w:after="0"/>
+            </w:pPr>
+            <w:r>
+              <w:rPr>
+                <w:rFonts w:ascii="Calibri" w:hAnsi="Calibri"/>
+                <w:color w:val="262626"/>
+                <w:sz w:val="16"/>
+              </w:rPr>
+              <w:t>R/figures/10_pathway_gene_tissue_boxplots_linear.R</w:t>
+            </w:r>
+          </w:p>
+        </w:tc>
+      </w:tr>
+      <w:tr>
+        <w:trPr/>
+        <w:tc>
+          <w:tcPr>
+            <w:tcW w:type="dxa" w:w="1728"/>
+            <w:vAlign w:val="center"/>
+            <w:tcMar>
+              <w:top w:w="55" w:type="dxa"/>
+              <w:bottom w:w="55" w:type="dxa"/>
+              <w:left w:w="70" w:type="dxa"/>
+              <w:right w:w="70" w:type="dxa"/>
+            </w:tcMar>
+          </w:tcPr>
+          <w:p>
+            <w:pPr>
+              <w:spacing w:line="276" w:lineRule="auto" w:before="0" w:after="0"/>
+            </w:pPr>
+            <w:r>
+              <w:rPr>
+                <w:rFonts w:ascii="Calibri" w:hAnsi="Calibri"/>
+                <w:color w:val="262626"/>
+                <w:sz w:val="16"/>
+              </w:rPr>
+              <w:t>Fig. 4c</w:t>
+            </w:r>
+          </w:p>
+        </w:tc>
+        <w:tc>
+          <w:tcPr>
+            <w:tcW w:type="dxa" w:w="1872"/>
+            <w:vAlign w:val="center"/>
+            <w:tcMar>
+              <w:top w:w="55" w:type="dxa"/>
+              <w:bottom w:w="55" w:type="dxa"/>
+              <w:left w:w="70" w:type="dxa"/>
+              <w:right w:w="70" w:type="dxa"/>
+            </w:tcMar>
+          </w:tcPr>
+          <w:p>
+            <w:pPr>
+              <w:spacing w:line="276" w:lineRule="auto" w:before="0" w:after="0"/>
+            </w:pPr>
+            <w:r>
+              <w:rPr>
+                <w:rFonts w:ascii="Calibri" w:hAnsi="Calibri"/>
+                <w:color w:val="262626"/>
+                <w:sz w:val="16"/>
+              </w:rPr>
+              <w:t>HR Linear Boxplot</w:t>
+            </w:r>
+          </w:p>
+        </w:tc>
+        <w:tc>
+          <w:tcPr>
+            <w:tcW w:type="dxa" w:w="1872"/>
+            <w:vAlign w:val="center"/>
+            <w:tcMar>
+              <w:top w:w="55" w:type="dxa"/>
+              <w:bottom w:w="55" w:type="dxa"/>
+              <w:left w:w="70" w:type="dxa"/>
+              <w:right w:w="70" w:type="dxa"/>
+            </w:tcMar>
+          </w:tcPr>
+          <w:p>
+            <w:pPr>
+              <w:spacing w:line="276" w:lineRule="auto" w:before="0" w:after="0"/>
+            </w:pPr>
+            <w:r>
+              <w:rPr>
+                <w:rFonts w:ascii="Calibri" w:hAnsi="Calibri"/>
+                <w:color w:val="262626"/>
+                <w:sz w:val="16"/>
+              </w:rPr>
+              <w:t>360 flight mice × 4 genes (26 tissues)</w:t>
+            </w:r>
+          </w:p>
+        </w:tc>
+        <w:tc>
+          <w:tcPr>
+            <w:tcW w:type="dxa" w:w="2160"/>
+            <w:vAlign w:val="center"/>
+            <w:tcMar>
+              <w:top w:w="55" w:type="dxa"/>
+              <w:bottom w:w="55" w:type="dxa"/>
+              <w:left w:w="70" w:type="dxa"/>
+              <w:right w:w="70" w:type="dxa"/>
+            </w:tcMar>
+          </w:tcPr>
+          <w:p>
+            <w:pPr>
+              <w:spacing w:line="276" w:lineRule="auto" w:before="0" w:after="0"/>
+            </w:pPr>
+            <w:r>
+              <w:rPr>
+                <w:rFonts w:ascii="Calibri" w:hAnsi="Calibri"/>
+                <w:color w:val="262626"/>
+                <w:sz w:val="16"/>
+              </w:rPr>
+              <w:t>Linear scale 2^log2 - 1, Mean hinge, Gene &amp; Pathway ANOVA</w:t>
+            </w:r>
+          </w:p>
+        </w:tc>
+        <w:tc>
+          <w:tcPr>
+            <w:tcW w:type="dxa" w:w="1728"/>
+            <w:vAlign w:val="center"/>
+            <w:tcMar>
+              <w:top w:w="55" w:type="dxa"/>
+              <w:bottom w:w="55" w:type="dxa"/>
+              <w:left w:w="70" w:type="dxa"/>
+              <w:right w:w="70" w:type="dxa"/>
+            </w:tcMar>
+          </w:tcPr>
+          <w:p>
+            <w:pPr>
+              <w:spacing w:line="276" w:lineRule="auto" w:before="0" w:after="0"/>
+            </w:pPr>
+            <w:r>
+              <w:rPr>
+                <w:rFonts w:ascii="Calibri" w:hAnsi="Calibri"/>
+                <w:color w:val="262626"/>
+                <w:sz w:val="16"/>
+              </w:rPr>
+              <w:t>R/figures/10_pathway_gene_tissue_boxplots_linear.R</w:t>
+            </w:r>
+          </w:p>
+        </w:tc>
+      </w:tr>
+      <w:tr>
+        <w:trPr/>
+        <w:tc>
+          <w:tcPr>
+            <w:tcW w:type="dxa" w:w="1728"/>
+            <w:vAlign w:val="center"/>
+            <w:shd w:fill="FAFCFD"/>
+            <w:tcMar>
+              <w:top w:w="55" w:type="dxa"/>
+              <w:bottom w:w="55" w:type="dxa"/>
+              <w:left w:w="70" w:type="dxa"/>
+              <w:right w:w="70" w:type="dxa"/>
+            </w:tcMar>
+          </w:tcPr>
+          <w:p>
+            <w:pPr>
+              <w:spacing w:line="276" w:lineRule="auto" w:before="0" w:after="0"/>
+            </w:pPr>
+            <w:r>
+              <w:rPr>
+                <w:rFonts w:ascii="Calibri" w:hAnsi="Calibri"/>
+                <w:color w:val="262626"/>
+                <w:sz w:val="16"/>
+              </w:rPr>
+              <w:t>Fig. 4d</w:t>
+            </w:r>
+          </w:p>
+        </w:tc>
+        <w:tc>
+          <w:tcPr>
+            <w:tcW w:type="dxa" w:w="1872"/>
+            <w:vAlign w:val="center"/>
+            <w:shd w:fill="FAFCFD"/>
+            <w:tcMar>
+              <w:top w:w="55" w:type="dxa"/>
+              <w:bottom w:w="55" w:type="dxa"/>
+              <w:left w:w="70" w:type="dxa"/>
+              <w:right w:w="70" w:type="dxa"/>
+            </w:tcMar>
+          </w:tcPr>
+          <w:p>
+            <w:pPr>
+              <w:spacing w:line="276" w:lineRule="auto" w:before="0" w:after="0"/>
+            </w:pPr>
+            <w:r>
+              <w:rPr>
+                <w:rFonts w:ascii="Calibri" w:hAnsi="Calibri"/>
+                <w:color w:val="262626"/>
+                <w:sz w:val="16"/>
+              </w:rPr>
+              <w:t>A-EJ Linear Boxplot</w:t>
+            </w:r>
+          </w:p>
+        </w:tc>
+        <w:tc>
+          <w:tcPr>
+            <w:tcW w:type="dxa" w:w="1872"/>
+            <w:vAlign w:val="center"/>
+            <w:shd w:fill="FAFCFD"/>
+            <w:tcMar>
+              <w:top w:w="55" w:type="dxa"/>
+              <w:bottom w:w="55" w:type="dxa"/>
+              <w:left w:w="70" w:type="dxa"/>
+              <w:right w:w="70" w:type="dxa"/>
+            </w:tcMar>
+          </w:tcPr>
+          <w:p>
+            <w:pPr>
+              <w:spacing w:line="276" w:lineRule="auto" w:before="0" w:after="0"/>
+            </w:pPr>
+            <w:r>
+              <w:rPr>
+                <w:rFonts w:ascii="Calibri" w:hAnsi="Calibri"/>
+                <w:color w:val="262626"/>
+                <w:sz w:val="16"/>
+              </w:rPr>
+              <w:t>360 flight mice × 4 genes (26 tissues)</w:t>
+            </w:r>
+          </w:p>
+        </w:tc>
+        <w:tc>
+          <w:tcPr>
+            <w:tcW w:type="dxa" w:w="2160"/>
+            <w:vAlign w:val="center"/>
+            <w:shd w:fill="FAFCFD"/>
+            <w:tcMar>
+              <w:top w:w="55" w:type="dxa"/>
+              <w:bottom w:w="55" w:type="dxa"/>
+              <w:left w:w="70" w:type="dxa"/>
+              <w:right w:w="70" w:type="dxa"/>
+            </w:tcMar>
+          </w:tcPr>
+          <w:p>
+            <w:pPr>
+              <w:spacing w:line="276" w:lineRule="auto" w:before="0" w:after="0"/>
+            </w:pPr>
+            <w:r>
+              <w:rPr>
+                <w:rFonts w:ascii="Calibri" w:hAnsi="Calibri"/>
+                <w:color w:val="262626"/>
+                <w:sz w:val="16"/>
+              </w:rPr>
+              <w:t>Linear scale 2^log2 - 1, Mean hinge, Gene &amp; Pathway ANOVA</w:t>
+            </w:r>
+          </w:p>
+        </w:tc>
+        <w:tc>
+          <w:tcPr>
+            <w:tcW w:type="dxa" w:w="1728"/>
+            <w:vAlign w:val="center"/>
+            <w:shd w:fill="FAFCFD"/>
+            <w:tcMar>
+              <w:top w:w="55" w:type="dxa"/>
+              <w:bottom w:w="55" w:type="dxa"/>
+              <w:left w:w="70" w:type="dxa"/>
+              <w:right w:w="70" w:type="dxa"/>
+            </w:tcMar>
+          </w:tcPr>
+          <w:p>
+            <w:pPr>
+              <w:spacing w:line="276" w:lineRule="auto" w:before="0" w:after="0"/>
+            </w:pPr>
+            <w:r>
+              <w:rPr>
+                <w:rFonts w:ascii="Calibri" w:hAnsi="Calibri"/>
+                <w:color w:val="262626"/>
+                <w:sz w:val="16"/>
+              </w:rPr>
+              <w:t>R/figures/10_pathway_gene_tissue_boxplots_linear.R</w:t>
+            </w:r>
+          </w:p>
+        </w:tc>
+      </w:tr>
+      <w:tr>
+        <w:trPr/>
+        <w:tc>
+          <w:tcPr>
+            <w:tcW w:type="dxa" w:w="1728"/>
+            <w:vAlign w:val="center"/>
+            <w:tcMar>
+              <w:top w:w="55" w:type="dxa"/>
+              <w:bottom w:w="55" w:type="dxa"/>
+              <w:left w:w="70" w:type="dxa"/>
+              <w:right w:w="70" w:type="dxa"/>
+            </w:tcMar>
+          </w:tcPr>
+          <w:p>
+            <w:pPr>
+              <w:spacing w:line="276" w:lineRule="auto" w:before="0" w:after="0"/>
+            </w:pPr>
+            <w:r>
+              <w:rPr>
+                <w:rFonts w:ascii="Calibri" w:hAnsi="Calibri"/>
+                <w:color w:val="262626"/>
+                <w:sz w:val="16"/>
+              </w:rPr>
+              <w:t>Fig. 4e</w:t>
+            </w:r>
+          </w:p>
+        </w:tc>
+        <w:tc>
+          <w:tcPr>
+            <w:tcW w:type="dxa" w:w="1872"/>
+            <w:vAlign w:val="center"/>
+            <w:tcMar>
+              <w:top w:w="55" w:type="dxa"/>
+              <w:bottom w:w="55" w:type="dxa"/>
+              <w:left w:w="70" w:type="dxa"/>
+              <w:right w:w="70" w:type="dxa"/>
+            </w:tcMar>
+          </w:tcPr>
+          <w:p>
+            <w:pPr>
+              <w:spacing w:line="276" w:lineRule="auto" w:before="0" w:after="0"/>
+            </w:pPr>
+            <w:r>
+              <w:rPr>
+                <w:rFonts w:ascii="Calibri" w:hAnsi="Calibri"/>
+                <w:color w:val="262626"/>
+                <w:sz w:val="16"/>
+              </w:rPr>
+              <w:t>DSB Spaceflight Meta-Analysis</w:t>
+            </w:r>
+          </w:p>
+        </w:tc>
+        <w:tc>
+          <w:tcPr>
+            <w:tcW w:type="dxa" w:w="1872"/>
+            <w:vAlign w:val="center"/>
+            <w:tcMar>
+              <w:top w:w="55" w:type="dxa"/>
+              <w:bottom w:w="55" w:type="dxa"/>
+              <w:left w:w="70" w:type="dxa"/>
+              <w:right w:w="70" w:type="dxa"/>
+            </w:tcMar>
+          </w:tcPr>
+          <w:p>
+            <w:pPr>
+              <w:spacing w:line="276" w:lineRule="auto" w:before="0" w:after="0"/>
+            </w:pPr>
+            <w:r>
+              <w:rPr>
+                <w:rFonts w:ascii="Calibri" w:hAnsi="Calibri"/>
+                <w:color w:val="262626"/>
+                <w:sz w:val="16"/>
+              </w:rPr>
+              <w:t>26 tissues × 29 DSB components</w:t>
+            </w:r>
+          </w:p>
+        </w:tc>
+        <w:tc>
+          <w:tcPr>
+            <w:tcW w:type="dxa" w:w="2160"/>
+            <w:vAlign w:val="center"/>
+            <w:tcMar>
+              <w:top w:w="55" w:type="dxa"/>
+              <w:bottom w:w="55" w:type="dxa"/>
+              <w:left w:w="70" w:type="dxa"/>
+              <w:right w:w="70" w:type="dxa"/>
             </w:tcMar>
           </w:tcPr>
           <w:p>
@@ -1979,12 +2259,11 @@
           <w:tcPr>
             <w:tcW w:type="dxa" w:w="1728"/>
             <w:vAlign w:val="center"/>
-            <w:shd w:fill="FAFCFD"/>
             <w:tcMar>
-              <w:top w:w="60" w:type="dxa"/>
-              <w:bottom w:w="60" w:type="dxa"/>
-              <w:left w:w="80" w:type="dxa"/>
-              <w:right w:w="80" w:type="dxa"/>
+              <w:top w:w="55" w:type="dxa"/>
+              <w:bottom w:w="55" w:type="dxa"/>
+              <w:left w:w="70" w:type="dxa"/>
+              <w:right w:w="70" w:type="dxa"/>
             </w:tcMar>
           </w:tcPr>
           <w:p>
@@ -2008,11 +2287,795 @@
           <w:tcPr>
             <w:tcW w:type="dxa" w:w="1728"/>
             <w:vAlign w:val="center"/>
+            <w:shd w:fill="FAFCFD"/>
             <w:tcMar>
-              <w:top w:w="60" w:type="dxa"/>
-              <w:bottom w:w="60" w:type="dxa"/>
-              <w:left w:w="80" w:type="dxa"/>
-              <w:right w:w="80" w:type="dxa"/>
+              <w:top w:w="55" w:type="dxa"/>
+              <w:bottom w:w="55" w:type="dxa"/>
+              <w:left w:w="70" w:type="dxa"/>
+              <w:right w:w="70" w:type="dxa"/>
+            </w:tcMar>
+          </w:tcPr>
+          <w:p>
+            <w:pPr>
+              <w:spacing w:line="276" w:lineRule="auto" w:before="0" w:after="0"/>
+            </w:pPr>
+            <w:r>
+              <w:rPr>
+                <w:rFonts w:ascii="Calibri" w:hAnsi="Calibri"/>
+                <w:color w:val="262626"/>
+                <w:sz w:val="16"/>
+              </w:rPr>
+              <w:t>Fig. 5a</w:t>
+            </w:r>
+          </w:p>
+        </w:tc>
+        <w:tc>
+          <w:tcPr>
+            <w:tcW w:type="dxa" w:w="1872"/>
+            <w:vAlign w:val="center"/>
+            <w:shd w:fill="FAFCFD"/>
+            <w:tcMar>
+              <w:top w:w="55" w:type="dxa"/>
+              <w:bottom w:w="55" w:type="dxa"/>
+              <w:left w:w="70" w:type="dxa"/>
+              <w:right w:w="70" w:type="dxa"/>
+            </w:tcMar>
+          </w:tcPr>
+          <w:p>
+            <w:pPr>
+              <w:spacing w:line="276" w:lineRule="auto" w:before="0" w:after="0"/>
+            </w:pPr>
+            <w:r>
+              <w:rPr>
+                <w:rFonts w:ascii="Calibri" w:hAnsi="Calibri"/>
+                <w:color w:val="262626"/>
+                <w:sz w:val="16"/>
+              </w:rPr>
+              <w:t>SSB Baseline Clustering</w:t>
+            </w:r>
+          </w:p>
+        </w:tc>
+        <w:tc>
+          <w:tcPr>
+            <w:tcW w:type="dxa" w:w="1872"/>
+            <w:vAlign w:val="center"/>
+            <w:shd w:fill="FAFCFD"/>
+            <w:tcMar>
+              <w:top w:w="55" w:type="dxa"/>
+              <w:bottom w:w="55" w:type="dxa"/>
+              <w:left w:w="70" w:type="dxa"/>
+              <w:right w:w="70" w:type="dxa"/>
+            </w:tcMar>
+          </w:tcPr>
+          <w:p>
+            <w:pPr>
+              <w:spacing w:line="276" w:lineRule="auto" w:before="0" w:after="0"/>
+            </w:pPr>
+            <w:r>
+              <w:rPr>
+                <w:rFonts w:ascii="Calibri" w:hAnsi="Calibri"/>
+                <w:color w:val="262626"/>
+                <w:sz w:val="16"/>
+              </w:rPr>
+              <w:t>26 tissues, 45 SSB components</w:t>
+            </w:r>
+          </w:p>
+        </w:tc>
+        <w:tc>
+          <w:tcPr>
+            <w:tcW w:type="dxa" w:w="2160"/>
+            <w:vAlign w:val="center"/>
+            <w:shd w:fill="FAFCFD"/>
+            <w:tcMar>
+              <w:top w:w="55" w:type="dxa"/>
+              <w:bottom w:w="55" w:type="dxa"/>
+              <w:left w:w="70" w:type="dxa"/>
+              <w:right w:w="70" w:type="dxa"/>
+            </w:tcMar>
+          </w:tcPr>
+          <w:p>
+            <w:pPr>
+              <w:spacing w:line="276" w:lineRule="auto" w:before="0" w:after="0"/>
+            </w:pPr>
+            <w:r>
+              <w:rPr>
+                <w:rFonts w:ascii="Calibri" w:hAnsi="Calibri"/>
+                <w:color w:val="262626"/>
+                <w:sz w:val="16"/>
+              </w:rPr>
+              <w:t>YARN qsmooth baseline (Neil2 excluded), 1 - ρ, average linkage</w:t>
+            </w:r>
+          </w:p>
+        </w:tc>
+        <w:tc>
+          <w:tcPr>
+            <w:tcW w:type="dxa" w:w="1728"/>
+            <w:vAlign w:val="center"/>
+            <w:shd w:fill="FAFCFD"/>
+            <w:tcMar>
+              <w:top w:w="55" w:type="dxa"/>
+              <w:bottom w:w="55" w:type="dxa"/>
+              <w:left w:w="70" w:type="dxa"/>
+              <w:right w:w="70" w:type="dxa"/>
+            </w:tcMar>
+          </w:tcPr>
+          <w:p>
+            <w:pPr>
+              <w:spacing w:line="276" w:lineRule="auto" w:before="0" w:after="0"/>
+            </w:pPr>
+            <w:r>
+              <w:rPr>
+                <w:rFonts w:ascii="Calibri" w:hAnsi="Calibri"/>
+                <w:color w:val="262626"/>
+                <w:sz w:val="16"/>
+              </w:rPr>
+              <w:t>R/figures/04_qsmooth_tree_heatmaps.R</w:t>
+            </w:r>
+          </w:p>
+        </w:tc>
+      </w:tr>
+      <w:tr>
+        <w:trPr/>
+        <w:tc>
+          <w:tcPr>
+            <w:tcW w:type="dxa" w:w="1728"/>
+            <w:vAlign w:val="center"/>
+            <w:tcMar>
+              <w:top w:w="55" w:type="dxa"/>
+              <w:bottom w:w="55" w:type="dxa"/>
+              <w:left w:w="70" w:type="dxa"/>
+              <w:right w:w="70" w:type="dxa"/>
+            </w:tcMar>
+          </w:tcPr>
+          <w:p>
+            <w:pPr>
+              <w:spacing w:line="276" w:lineRule="auto" w:before="0" w:after="0"/>
+            </w:pPr>
+            <w:r>
+              <w:rPr>
+                <w:rFonts w:ascii="Calibri" w:hAnsi="Calibri"/>
+                <w:color w:val="262626"/>
+                <w:sz w:val="16"/>
+              </w:rPr>
+              <w:t>Fig. 5b</w:t>
+            </w:r>
+          </w:p>
+        </w:tc>
+        <w:tc>
+          <w:tcPr>
+            <w:tcW w:type="dxa" w:w="1872"/>
+            <w:vAlign w:val="center"/>
+            <w:tcMar>
+              <w:top w:w="55" w:type="dxa"/>
+              <w:bottom w:w="55" w:type="dxa"/>
+              <w:left w:w="70" w:type="dxa"/>
+              <w:right w:w="70" w:type="dxa"/>
+            </w:tcMar>
+          </w:tcPr>
+          <w:p>
+            <w:pPr>
+              <w:spacing w:line="276" w:lineRule="auto" w:before="0" w:after="0"/>
+            </w:pPr>
+            <w:r>
+              <w:rPr>
+                <w:rFonts w:ascii="Calibri" w:hAnsi="Calibri"/>
+                <w:color w:val="262626"/>
+                <w:sz w:val="16"/>
+              </w:rPr>
+              <w:t>BER Linear Boxplot</w:t>
+            </w:r>
+          </w:p>
+        </w:tc>
+        <w:tc>
+          <w:tcPr>
+            <w:tcW w:type="dxa" w:w="1872"/>
+            <w:vAlign w:val="center"/>
+            <w:tcMar>
+              <w:top w:w="55" w:type="dxa"/>
+              <w:bottom w:w="55" w:type="dxa"/>
+              <w:left w:w="70" w:type="dxa"/>
+              <w:right w:w="70" w:type="dxa"/>
+            </w:tcMar>
+          </w:tcPr>
+          <w:p>
+            <w:pPr>
+              <w:spacing w:line="276" w:lineRule="auto" w:before="0" w:after="0"/>
+            </w:pPr>
+            <w:r>
+              <w:rPr>
+                <w:rFonts w:ascii="Calibri" w:hAnsi="Calibri"/>
+                <w:color w:val="262626"/>
+                <w:sz w:val="16"/>
+              </w:rPr>
+              <w:t>360 flight mice × 3 genes (26 tissues)</w:t>
+            </w:r>
+          </w:p>
+        </w:tc>
+        <w:tc>
+          <w:tcPr>
+            <w:tcW w:type="dxa" w:w="2160"/>
+            <w:vAlign w:val="center"/>
+            <w:tcMar>
+              <w:top w:w="55" w:type="dxa"/>
+              <w:bottom w:w="55" w:type="dxa"/>
+              <w:left w:w="70" w:type="dxa"/>
+              <w:right w:w="70" w:type="dxa"/>
+            </w:tcMar>
+          </w:tcPr>
+          <w:p>
+            <w:pPr>
+              <w:spacing w:line="276" w:lineRule="auto" w:before="0" w:after="0"/>
+            </w:pPr>
+            <w:r>
+              <w:rPr>
+                <w:rFonts w:ascii="Calibri" w:hAnsi="Calibri"/>
+                <w:color w:val="262626"/>
+                <w:sz w:val="16"/>
+              </w:rPr>
+              <w:t>Linear scale 2^log2 - 1, Mean hinge, Gene &amp; Pathway ANOVA</w:t>
+            </w:r>
+          </w:p>
+        </w:tc>
+        <w:tc>
+          <w:tcPr>
+            <w:tcW w:type="dxa" w:w="1728"/>
+            <w:vAlign w:val="center"/>
+            <w:tcMar>
+              <w:top w:w="55" w:type="dxa"/>
+              <w:bottom w:w="55" w:type="dxa"/>
+              <w:left w:w="70" w:type="dxa"/>
+              <w:right w:w="70" w:type="dxa"/>
+            </w:tcMar>
+          </w:tcPr>
+          <w:p>
+            <w:pPr>
+              <w:spacing w:line="276" w:lineRule="auto" w:before="0" w:after="0"/>
+            </w:pPr>
+            <w:r>
+              <w:rPr>
+                <w:rFonts w:ascii="Calibri" w:hAnsi="Calibri"/>
+                <w:color w:val="262626"/>
+                <w:sz w:val="16"/>
+              </w:rPr>
+              <w:t>R/figures/10_pathway_gene_tissue_boxplots_linear.R</w:t>
+            </w:r>
+          </w:p>
+        </w:tc>
+      </w:tr>
+      <w:tr>
+        <w:trPr/>
+        <w:tc>
+          <w:tcPr>
+            <w:tcW w:type="dxa" w:w="1728"/>
+            <w:vAlign w:val="center"/>
+            <w:shd w:fill="FAFCFD"/>
+            <w:tcMar>
+              <w:top w:w="55" w:type="dxa"/>
+              <w:bottom w:w="55" w:type="dxa"/>
+              <w:left w:w="70" w:type="dxa"/>
+              <w:right w:w="70" w:type="dxa"/>
+            </w:tcMar>
+          </w:tcPr>
+          <w:p>
+            <w:pPr>
+              <w:spacing w:line="276" w:lineRule="auto" w:before="0" w:after="0"/>
+            </w:pPr>
+            <w:r>
+              <w:rPr>
+                <w:rFonts w:ascii="Calibri" w:hAnsi="Calibri"/>
+                <w:color w:val="262626"/>
+                <w:sz w:val="16"/>
+              </w:rPr>
+              <w:t>Fig. 5c</w:t>
+            </w:r>
+          </w:p>
+        </w:tc>
+        <w:tc>
+          <w:tcPr>
+            <w:tcW w:type="dxa" w:w="1872"/>
+            <w:vAlign w:val="center"/>
+            <w:shd w:fill="FAFCFD"/>
+            <w:tcMar>
+              <w:top w:w="55" w:type="dxa"/>
+              <w:bottom w:w="55" w:type="dxa"/>
+              <w:left w:w="70" w:type="dxa"/>
+              <w:right w:w="70" w:type="dxa"/>
+            </w:tcMar>
+          </w:tcPr>
+          <w:p>
+            <w:pPr>
+              <w:spacing w:line="276" w:lineRule="auto" w:before="0" w:after="0"/>
+            </w:pPr>
+            <w:r>
+              <w:rPr>
+                <w:rFonts w:ascii="Calibri" w:hAnsi="Calibri"/>
+                <w:color w:val="262626"/>
+                <w:sz w:val="16"/>
+              </w:rPr>
+              <w:t>NER Linear Boxplot</w:t>
+            </w:r>
+          </w:p>
+        </w:tc>
+        <w:tc>
+          <w:tcPr>
+            <w:tcW w:type="dxa" w:w="1872"/>
+            <w:vAlign w:val="center"/>
+            <w:shd w:fill="FAFCFD"/>
+            <w:tcMar>
+              <w:top w:w="55" w:type="dxa"/>
+              <w:bottom w:w="55" w:type="dxa"/>
+              <w:left w:w="70" w:type="dxa"/>
+              <w:right w:w="70" w:type="dxa"/>
+            </w:tcMar>
+          </w:tcPr>
+          <w:p>
+            <w:pPr>
+              <w:spacing w:line="276" w:lineRule="auto" w:before="0" w:after="0"/>
+            </w:pPr>
+            <w:r>
+              <w:rPr>
+                <w:rFonts w:ascii="Calibri" w:hAnsi="Calibri"/>
+                <w:color w:val="262626"/>
+                <w:sz w:val="16"/>
+              </w:rPr>
+              <w:t>360 flight mice × 7 genes (26 tissues)</w:t>
+            </w:r>
+          </w:p>
+        </w:tc>
+        <w:tc>
+          <w:tcPr>
+            <w:tcW w:type="dxa" w:w="2160"/>
+            <w:vAlign w:val="center"/>
+            <w:shd w:fill="FAFCFD"/>
+            <w:tcMar>
+              <w:top w:w="55" w:type="dxa"/>
+              <w:bottom w:w="55" w:type="dxa"/>
+              <w:left w:w="70" w:type="dxa"/>
+              <w:right w:w="70" w:type="dxa"/>
+            </w:tcMar>
+          </w:tcPr>
+          <w:p>
+            <w:pPr>
+              <w:spacing w:line="276" w:lineRule="auto" w:before="0" w:after="0"/>
+            </w:pPr>
+            <w:r>
+              <w:rPr>
+                <w:rFonts w:ascii="Calibri" w:hAnsi="Calibri"/>
+                <w:color w:val="262626"/>
+                <w:sz w:val="16"/>
+              </w:rPr>
+              <w:t>Linear scale 2^log2 - 1, Glyphic coding, Gene &amp; Pathway ANOVA</w:t>
+            </w:r>
+          </w:p>
+        </w:tc>
+        <w:tc>
+          <w:tcPr>
+            <w:tcW w:type="dxa" w:w="1728"/>
+            <w:vAlign w:val="center"/>
+            <w:shd w:fill="FAFCFD"/>
+            <w:tcMar>
+              <w:top w:w="55" w:type="dxa"/>
+              <w:bottom w:w="55" w:type="dxa"/>
+              <w:left w:w="70" w:type="dxa"/>
+              <w:right w:w="70" w:type="dxa"/>
+            </w:tcMar>
+          </w:tcPr>
+          <w:p>
+            <w:pPr>
+              <w:spacing w:line="276" w:lineRule="auto" w:before="0" w:after="0"/>
+            </w:pPr>
+            <w:r>
+              <w:rPr>
+                <w:rFonts w:ascii="Calibri" w:hAnsi="Calibri"/>
+                <w:color w:val="262626"/>
+                <w:sz w:val="16"/>
+              </w:rPr>
+              <w:t>R/figures/10_pathway_gene_tissue_boxplots_linear.R</w:t>
+            </w:r>
+          </w:p>
+        </w:tc>
+      </w:tr>
+      <w:tr>
+        <w:trPr/>
+        <w:tc>
+          <w:tcPr>
+            <w:tcW w:type="dxa" w:w="1728"/>
+            <w:vAlign w:val="center"/>
+            <w:tcMar>
+              <w:top w:w="55" w:type="dxa"/>
+              <w:bottom w:w="55" w:type="dxa"/>
+              <w:left w:w="70" w:type="dxa"/>
+              <w:right w:w="70" w:type="dxa"/>
+            </w:tcMar>
+          </w:tcPr>
+          <w:p>
+            <w:pPr>
+              <w:spacing w:line="276" w:lineRule="auto" w:before="0" w:after="0"/>
+            </w:pPr>
+            <w:r>
+              <w:rPr>
+                <w:rFonts w:ascii="Calibri" w:hAnsi="Calibri"/>
+                <w:color w:val="262626"/>
+                <w:sz w:val="16"/>
+              </w:rPr>
+              <w:t>Fig. 5d</w:t>
+            </w:r>
+          </w:p>
+        </w:tc>
+        <w:tc>
+          <w:tcPr>
+            <w:tcW w:type="dxa" w:w="1872"/>
+            <w:vAlign w:val="center"/>
+            <w:tcMar>
+              <w:top w:w="55" w:type="dxa"/>
+              <w:bottom w:w="55" w:type="dxa"/>
+              <w:left w:w="70" w:type="dxa"/>
+              <w:right w:w="70" w:type="dxa"/>
+            </w:tcMar>
+          </w:tcPr>
+          <w:p>
+            <w:pPr>
+              <w:spacing w:line="276" w:lineRule="auto" w:before="0" w:after="0"/>
+            </w:pPr>
+            <w:r>
+              <w:rPr>
+                <w:rFonts w:ascii="Calibri" w:hAnsi="Calibri"/>
+                <w:color w:val="262626"/>
+                <w:sz w:val="16"/>
+              </w:rPr>
+              <w:t>MMR Linear Boxplot</w:t>
+            </w:r>
+          </w:p>
+        </w:tc>
+        <w:tc>
+          <w:tcPr>
+            <w:tcW w:type="dxa" w:w="1872"/>
+            <w:vAlign w:val="center"/>
+            <w:tcMar>
+              <w:top w:w="55" w:type="dxa"/>
+              <w:bottom w:w="55" w:type="dxa"/>
+              <w:left w:w="70" w:type="dxa"/>
+              <w:right w:w="70" w:type="dxa"/>
+            </w:tcMar>
+          </w:tcPr>
+          <w:p>
+            <w:pPr>
+              <w:spacing w:line="276" w:lineRule="auto" w:before="0" w:after="0"/>
+            </w:pPr>
+            <w:r>
+              <w:rPr>
+                <w:rFonts w:ascii="Calibri" w:hAnsi="Calibri"/>
+                <w:color w:val="262626"/>
+                <w:sz w:val="16"/>
+              </w:rPr>
+              <w:t>360 flight mice × 2 genes (26 tissues)</w:t>
+            </w:r>
+          </w:p>
+        </w:tc>
+        <w:tc>
+          <w:tcPr>
+            <w:tcW w:type="dxa" w:w="2160"/>
+            <w:vAlign w:val="center"/>
+            <w:tcMar>
+              <w:top w:w="55" w:type="dxa"/>
+              <w:bottom w:w="55" w:type="dxa"/>
+              <w:left w:w="70" w:type="dxa"/>
+              <w:right w:w="70" w:type="dxa"/>
+            </w:tcMar>
+          </w:tcPr>
+          <w:p>
+            <w:pPr>
+              <w:spacing w:line="276" w:lineRule="auto" w:before="0" w:after="0"/>
+            </w:pPr>
+            <w:r>
+              <w:rPr>
+                <w:rFonts w:ascii="Calibri" w:hAnsi="Calibri"/>
+                <w:color w:val="262626"/>
+                <w:sz w:val="16"/>
+              </w:rPr>
+              <w:t>Linear scale 2^log2 - 1, Mean hinge, Gene &amp; Pathway ANOVA</w:t>
+            </w:r>
+          </w:p>
+        </w:tc>
+        <w:tc>
+          <w:tcPr>
+            <w:tcW w:type="dxa" w:w="1728"/>
+            <w:vAlign w:val="center"/>
+            <w:tcMar>
+              <w:top w:w="55" w:type="dxa"/>
+              <w:bottom w:w="55" w:type="dxa"/>
+              <w:left w:w="70" w:type="dxa"/>
+              <w:right w:w="70" w:type="dxa"/>
+            </w:tcMar>
+          </w:tcPr>
+          <w:p>
+            <w:pPr>
+              <w:spacing w:line="276" w:lineRule="auto" w:before="0" w:after="0"/>
+            </w:pPr>
+            <w:r>
+              <w:rPr>
+                <w:rFonts w:ascii="Calibri" w:hAnsi="Calibri"/>
+                <w:color w:val="262626"/>
+                <w:sz w:val="16"/>
+              </w:rPr>
+              <w:t>R/figures/10_pathway_gene_tissue_boxplots_linear.R</w:t>
+            </w:r>
+          </w:p>
+        </w:tc>
+      </w:tr>
+      <w:tr>
+        <w:trPr/>
+        <w:tc>
+          <w:tcPr>
+            <w:tcW w:type="dxa" w:w="1728"/>
+            <w:vAlign w:val="center"/>
+            <w:shd w:fill="FAFCFD"/>
+            <w:tcMar>
+              <w:top w:w="55" w:type="dxa"/>
+              <w:bottom w:w="55" w:type="dxa"/>
+              <w:left w:w="70" w:type="dxa"/>
+              <w:right w:w="70" w:type="dxa"/>
+            </w:tcMar>
+          </w:tcPr>
+          <w:p>
+            <w:pPr>
+              <w:spacing w:line="276" w:lineRule="auto" w:before="0" w:after="0"/>
+            </w:pPr>
+            <w:r>
+              <w:rPr>
+                <w:rFonts w:ascii="Calibri" w:hAnsi="Calibri"/>
+                <w:color w:val="262626"/>
+                <w:sz w:val="16"/>
+              </w:rPr>
+              <w:t>Fig. 5e</w:t>
+            </w:r>
+          </w:p>
+        </w:tc>
+        <w:tc>
+          <w:tcPr>
+            <w:tcW w:type="dxa" w:w="1872"/>
+            <w:vAlign w:val="center"/>
+            <w:shd w:fill="FAFCFD"/>
+            <w:tcMar>
+              <w:top w:w="55" w:type="dxa"/>
+              <w:bottom w:w="55" w:type="dxa"/>
+              <w:left w:w="70" w:type="dxa"/>
+              <w:right w:w="70" w:type="dxa"/>
+            </w:tcMar>
+          </w:tcPr>
+          <w:p>
+            <w:pPr>
+              <w:spacing w:line="276" w:lineRule="auto" w:before="0" w:after="0"/>
+            </w:pPr>
+            <w:r>
+              <w:rPr>
+                <w:rFonts w:ascii="Calibri" w:hAnsi="Calibri"/>
+                <w:color w:val="262626"/>
+                <w:sz w:val="16"/>
+              </w:rPr>
+              <w:t>FA Linear Boxplot</w:t>
+            </w:r>
+          </w:p>
+        </w:tc>
+        <w:tc>
+          <w:tcPr>
+            <w:tcW w:type="dxa" w:w="1872"/>
+            <w:vAlign w:val="center"/>
+            <w:shd w:fill="FAFCFD"/>
+            <w:tcMar>
+              <w:top w:w="55" w:type="dxa"/>
+              <w:bottom w:w="55" w:type="dxa"/>
+              <w:left w:w="70" w:type="dxa"/>
+              <w:right w:w="70" w:type="dxa"/>
+            </w:tcMar>
+          </w:tcPr>
+          <w:p>
+            <w:pPr>
+              <w:spacing w:line="276" w:lineRule="auto" w:before="0" w:after="0"/>
+            </w:pPr>
+            <w:r>
+              <w:rPr>
+                <w:rFonts w:ascii="Calibri" w:hAnsi="Calibri"/>
+                <w:color w:val="262626"/>
+                <w:sz w:val="16"/>
+              </w:rPr>
+              <w:t>360 flight mice × 2 genes (26 tissues)</w:t>
+            </w:r>
+          </w:p>
+        </w:tc>
+        <w:tc>
+          <w:tcPr>
+            <w:tcW w:type="dxa" w:w="2160"/>
+            <w:vAlign w:val="center"/>
+            <w:shd w:fill="FAFCFD"/>
+            <w:tcMar>
+              <w:top w:w="55" w:type="dxa"/>
+              <w:bottom w:w="55" w:type="dxa"/>
+              <w:left w:w="70" w:type="dxa"/>
+              <w:right w:w="70" w:type="dxa"/>
+            </w:tcMar>
+          </w:tcPr>
+          <w:p>
+            <w:pPr>
+              <w:spacing w:line="276" w:lineRule="auto" w:before="0" w:after="0"/>
+            </w:pPr>
+            <w:r>
+              <w:rPr>
+                <w:rFonts w:ascii="Calibri" w:hAnsi="Calibri"/>
+                <w:color w:val="262626"/>
+                <w:sz w:val="16"/>
+              </w:rPr>
+              <w:t>Linear scale 2^log2 - 1, Mean hinge, Gene &amp; Pathway ANOVA</w:t>
+            </w:r>
+          </w:p>
+        </w:tc>
+        <w:tc>
+          <w:tcPr>
+            <w:tcW w:type="dxa" w:w="1728"/>
+            <w:vAlign w:val="center"/>
+            <w:shd w:fill="FAFCFD"/>
+            <w:tcMar>
+              <w:top w:w="55" w:type="dxa"/>
+              <w:bottom w:w="55" w:type="dxa"/>
+              <w:left w:w="70" w:type="dxa"/>
+              <w:right w:w="70" w:type="dxa"/>
+            </w:tcMar>
+          </w:tcPr>
+          <w:p>
+            <w:pPr>
+              <w:spacing w:line="276" w:lineRule="auto" w:before="0" w:after="0"/>
+            </w:pPr>
+            <w:r>
+              <w:rPr>
+                <w:rFonts w:ascii="Calibri" w:hAnsi="Calibri"/>
+                <w:color w:val="262626"/>
+                <w:sz w:val="16"/>
+              </w:rPr>
+              <w:t>R/figures/10_pathway_gene_tissue_boxplots_linear.R</w:t>
+            </w:r>
+          </w:p>
+        </w:tc>
+      </w:tr>
+      <w:tr>
+        <w:trPr/>
+        <w:tc>
+          <w:tcPr>
+            <w:tcW w:type="dxa" w:w="1728"/>
+            <w:vAlign w:val="center"/>
+            <w:tcMar>
+              <w:top w:w="55" w:type="dxa"/>
+              <w:bottom w:w="55" w:type="dxa"/>
+              <w:left w:w="70" w:type="dxa"/>
+              <w:right w:w="70" w:type="dxa"/>
+            </w:tcMar>
+          </w:tcPr>
+          <w:p>
+            <w:pPr>
+              <w:spacing w:line="276" w:lineRule="auto" w:before="0" w:after="0"/>
+            </w:pPr>
+            <w:r>
+              <w:rPr>
+                <w:rFonts w:ascii="Calibri" w:hAnsi="Calibri"/>
+                <w:color w:val="262626"/>
+                <w:sz w:val="16"/>
+              </w:rPr>
+              <w:t>Fig. 5f</w:t>
+            </w:r>
+          </w:p>
+        </w:tc>
+        <w:tc>
+          <w:tcPr>
+            <w:tcW w:type="dxa" w:w="1872"/>
+            <w:vAlign w:val="center"/>
+            <w:tcMar>
+              <w:top w:w="55" w:type="dxa"/>
+              <w:bottom w:w="55" w:type="dxa"/>
+              <w:left w:w="70" w:type="dxa"/>
+              <w:right w:w="70" w:type="dxa"/>
+            </w:tcMar>
+          </w:tcPr>
+          <w:p>
+            <w:pPr>
+              <w:spacing w:line="276" w:lineRule="auto" w:before="0" w:after="0"/>
+            </w:pPr>
+            <w:r>
+              <w:rPr>
+                <w:rFonts w:ascii="Calibri" w:hAnsi="Calibri"/>
+                <w:color w:val="262626"/>
+                <w:sz w:val="16"/>
+              </w:rPr>
+              <w:t>SSB Spaceflight Meta-Analysis</w:t>
+            </w:r>
+          </w:p>
+        </w:tc>
+        <w:tc>
+          <w:tcPr>
+            <w:tcW w:type="dxa" w:w="1872"/>
+            <w:vAlign w:val="center"/>
+            <w:tcMar>
+              <w:top w:w="55" w:type="dxa"/>
+              <w:bottom w:w="55" w:type="dxa"/>
+              <w:left w:w="70" w:type="dxa"/>
+              <w:right w:w="70" w:type="dxa"/>
+            </w:tcMar>
+          </w:tcPr>
+          <w:p>
+            <w:pPr>
+              <w:spacing w:line="276" w:lineRule="auto" w:before="0" w:after="0"/>
+            </w:pPr>
+            <w:r>
+              <w:rPr>
+                <w:rFonts w:ascii="Calibri" w:hAnsi="Calibri"/>
+                <w:color w:val="262626"/>
+                <w:sz w:val="16"/>
+              </w:rPr>
+              <w:t>26 tissues × 45 SSB components</w:t>
+            </w:r>
+          </w:p>
+        </w:tc>
+        <w:tc>
+          <w:tcPr>
+            <w:tcW w:type="dxa" w:w="2160"/>
+            <w:vAlign w:val="center"/>
+            <w:tcMar>
+              <w:top w:w="55" w:type="dxa"/>
+              <w:bottom w:w="55" w:type="dxa"/>
+              <w:left w:w="70" w:type="dxa"/>
+              <w:right w:w="70" w:type="dxa"/>
+            </w:tcMar>
+          </w:tcPr>
+          <w:p>
+            <w:pPr>
+              <w:spacing w:line="276" w:lineRule="auto" w:before="0" w:after="0"/>
+            </w:pPr>
+            <w:r>
+              <w:rPr>
+                <w:rFonts w:ascii="Calibri" w:hAnsi="Calibri"/>
+                <w:color w:val="262626"/>
+                <w:sz w:val="16"/>
+              </w:rPr>
+              <w:t>Median of mission medians log2FC, signed Stouffer meta-Z</w:t>
+            </w:r>
+          </w:p>
+        </w:tc>
+        <w:tc>
+          <w:tcPr>
+            <w:tcW w:type="dxa" w:w="1728"/>
+            <w:vAlign w:val="center"/>
+            <w:tcMar>
+              <w:top w:w="55" w:type="dxa"/>
+              <w:bottom w:w="55" w:type="dxa"/>
+              <w:left w:w="70" w:type="dxa"/>
+              <w:right w:w="70" w:type="dxa"/>
+            </w:tcMar>
+          </w:tcPr>
+          <w:p>
+            <w:pPr>
+              <w:spacing w:line="276" w:lineRule="auto" w:before="0" w:after="0"/>
+            </w:pPr>
+            <w:r>
+              <w:rPr>
+                <w:rFonts w:ascii="Calibri" w:hAnsi="Calibri"/>
+                <w:color w:val="262626"/>
+                <w:sz w:val="16"/>
+              </w:rPr>
+              <w:t>R/figures/05_meta_log2fc_heatmaps.R</w:t>
+            </w:r>
+          </w:p>
+        </w:tc>
+      </w:tr>
+      <w:tr>
+        <w:trPr/>
+        <w:tc>
+          <w:tcPr>
+            <w:tcW w:type="dxa" w:w="1728"/>
+            <w:vAlign w:val="center"/>
+            <w:shd w:fill="FAFCFD"/>
+            <w:tcMar>
+              <w:top w:w="55" w:type="dxa"/>
+              <w:bottom w:w="55" w:type="dxa"/>
+              <w:left w:w="70" w:type="dxa"/>
+              <w:right w:w="70" w:type="dxa"/>
             </w:tcMar>
           </w:tcPr>
           <w:p>
@@ -2033,11 +3096,12 @@
           <w:tcPr>
             <w:tcW w:type="dxa" w:w="1872"/>
             <w:vAlign w:val="center"/>
+            <w:shd w:fill="FAFCFD"/>
             <w:tcMar>
-              <w:top w:w="60" w:type="dxa"/>
-              <w:bottom w:w="60" w:type="dxa"/>
-              <w:left w:w="80" w:type="dxa"/>
-              <w:right w:w="80" w:type="dxa"/>
+              <w:top w:w="55" w:type="dxa"/>
+              <w:bottom w:w="55" w:type="dxa"/>
+              <w:left w:w="70" w:type="dxa"/>
+              <w:right w:w="70" w:type="dxa"/>
             </w:tcMar>
           </w:tcPr>
           <w:p>
@@ -2058,11 +3122,12 @@
           <w:tcPr>
             <w:tcW w:type="dxa" w:w="1872"/>
             <w:vAlign w:val="center"/>
+            <w:shd w:fill="FAFCFD"/>
             <w:tcMar>
-              <w:top w:w="60" w:type="dxa"/>
-              <w:bottom w:w="60" w:type="dxa"/>
-              <w:left w:w="80" w:type="dxa"/>
-              <w:right w:w="80" w:type="dxa"/>
+              <w:top w:w="55" w:type="dxa"/>
+              <w:bottom w:w="55" w:type="dxa"/>
+              <w:left w:w="70" w:type="dxa"/>
+              <w:right w:w="70" w:type="dxa"/>
             </w:tcMar>
           </w:tcPr>
           <w:p>
@@ -2083,11 +3148,12 @@
           <w:tcPr>
             <w:tcW w:type="dxa" w:w="2160"/>
             <w:vAlign w:val="center"/>
+            <w:shd w:fill="FAFCFD"/>
             <w:tcMar>
-              <w:top w:w="60" w:type="dxa"/>
-              <w:bottom w:w="60" w:type="dxa"/>
-              <w:left w:w="80" w:type="dxa"/>
-              <w:right w:w="80" w:type="dxa"/>
+              <w:top w:w="55" w:type="dxa"/>
+              <w:bottom w:w="55" w:type="dxa"/>
+              <w:left w:w="70" w:type="dxa"/>
+              <w:right w:w="70" w:type="dxa"/>
             </w:tcMar>
           </w:tcPr>
           <w:p>
@@ -2108,11 +3174,12 @@
           <w:tcPr>
             <w:tcW w:type="dxa" w:w="1728"/>
             <w:vAlign w:val="center"/>
+            <w:shd w:fill="FAFCFD"/>
             <w:tcMar>
-              <w:top w:w="60" w:type="dxa"/>
-              <w:bottom w:w="60" w:type="dxa"/>
-              <w:left w:w="80" w:type="dxa"/>
-              <w:right w:w="80" w:type="dxa"/>
+              <w:top w:w="55" w:type="dxa"/>
+              <w:bottom w:w="55" w:type="dxa"/>
+              <w:left w:w="70" w:type="dxa"/>
+              <w:right w:w="70" w:type="dxa"/>
             </w:tcMar>
           </w:tcPr>
           <w:p>
@@ -2136,12 +3203,11 @@
           <w:tcPr>
             <w:tcW w:type="dxa" w:w="1728"/>
             <w:vAlign w:val="center"/>
-            <w:shd w:fill="FAFCFD"/>
             <w:tcMar>
-              <w:top w:w="60" w:type="dxa"/>
-              <w:bottom w:w="60" w:type="dxa"/>
-              <w:left w:w="80" w:type="dxa"/>
-              <w:right w:w="80" w:type="dxa"/>
+              <w:top w:w="55" w:type="dxa"/>
+              <w:bottom w:w="55" w:type="dxa"/>
+              <w:left w:w="70" w:type="dxa"/>
+              <w:right w:w="70" w:type="dxa"/>
             </w:tcMar>
           </w:tcPr>
           <w:p>
@@ -2154,7 +3220,7 @@
                 <w:color w:val="262626"/>
                 <w:sz w:val="16"/>
               </w:rPr>
-              <w:t>Fig. S3a / S4a</w:t>
+              <w:t>Fig. S2a / S2b</w:t>
             </w:r>
           </w:p>
         </w:tc>
@@ -2162,12 +3228,11 @@
           <w:tcPr>
             <w:tcW w:type="dxa" w:w="1872"/>
             <w:vAlign w:val="center"/>
-            <w:shd w:fill="FAFCFD"/>
             <w:tcMar>
-              <w:top w:w="60" w:type="dxa"/>
-              <w:bottom w:w="60" w:type="dxa"/>
-              <w:left w:w="80" w:type="dxa"/>
-              <w:right w:w="80" w:type="dxa"/>
+              <w:top w:w="55" w:type="dxa"/>
+              <w:bottom w:w="55" w:type="dxa"/>
+              <w:left w:w="70" w:type="dxa"/>
+              <w:right w:w="70" w:type="dxa"/>
             </w:tcMar>
           </w:tcPr>
           <w:p>
@@ -2180,7 +3245,7 @@
                 <w:color w:val="262626"/>
                 <w:sz w:val="16"/>
               </w:rPr>
-              <w:t>Multi-Tissue UpSet Repertoire</w:t>
+              <w:t>Kidney Overlap &amp; Common-Dir</w:t>
             </w:r>
           </w:p>
         </w:tc>
@@ -2188,12 +3253,11 @@
           <w:tcPr>
             <w:tcW w:type="dxa" w:w="1872"/>
             <w:vAlign w:val="center"/>
-            <w:shd w:fill="FAFCFD"/>
             <w:tcMar>
-              <w:top w:w="60" w:type="dxa"/>
-              <w:bottom w:w="60" w:type="dxa"/>
-              <w:left w:w="80" w:type="dxa"/>
-              <w:right w:w="80" w:type="dxa"/>
+              <w:top w:w="55" w:type="dxa"/>
+              <w:bottom w:w="55" w:type="dxa"/>
+              <w:left w:w="70" w:type="dxa"/>
+              <w:right w:w="70" w:type="dxa"/>
             </w:tcMar>
           </w:tcPr>
           <w:p>
@@ -2206,7 +3270,7 @@
                 <w:color w:val="262626"/>
                 <w:sz w:val="16"/>
               </w:rPr>
-              <w:t>NES &gt; 1 tissues / NES &lt; -1 tissues</w:t>
+              <w:t>Kidney (5 OSDR accessions)</w:t>
             </w:r>
           </w:p>
         </w:tc>
@@ -2214,12 +3278,11 @@
           <w:tcPr>
             <w:tcW w:type="dxa" w:w="2160"/>
             <w:vAlign w:val="center"/>
-            <w:shd w:fill="FAFCFD"/>
             <w:tcMar>
-              <w:top w:w="60" w:type="dxa"/>
-              <w:bottom w:w="60" w:type="dxa"/>
-              <w:left w:w="80" w:type="dxa"/>
-              <w:right w:w="80" w:type="dxa"/>
+              <w:top w:w="55" w:type="dxa"/>
+              <w:bottom w:w="55" w:type="dxa"/>
+              <w:left w:w="70" w:type="dxa"/>
+              <w:right w:w="70" w:type="dxa"/>
             </w:tcMar>
           </w:tcPr>
           <w:p>
@@ -2232,7 +3295,139 @@
                 <w:color w:val="262626"/>
                 <w:sz w:val="16"/>
               </w:rPr>
-              <w:t>Binary membership pattern matrix, UpSet intersections</w:t>
+              <w:t>Venn intersection &amp; common-direction top 30 DEGs</w:t>
+            </w:r>
+          </w:p>
+        </w:tc>
+        <w:tc>
+          <w:tcPr>
+            <w:tcW w:type="dxa" w:w="1728"/>
+            <w:vAlign w:val="center"/>
+            <w:tcMar>
+              <w:top w:w="55" w:type="dxa"/>
+              <w:bottom w:w="55" w:type="dxa"/>
+              <w:left w:w="70" w:type="dxa"/>
+              <w:right w:w="70" w:type="dxa"/>
+            </w:tcMar>
+          </w:tcPr>
+          <w:p>
+            <w:pPr>
+              <w:spacing w:line="276" w:lineRule="auto" w:before="0" w:after="0"/>
+            </w:pPr>
+            <w:r>
+              <w:rPr>
+                <w:rFonts w:ascii="Calibri" w:hAnsi="Calibri"/>
+                <w:color w:val="262626"/>
+                <w:sz w:val="16"/>
+              </w:rPr>
+              <w:t>R/figures/03_kidney_thymus_venn.R</w:t>
+            </w:r>
+          </w:p>
+        </w:tc>
+      </w:tr>
+      <w:tr>
+        <w:trPr/>
+        <w:tc>
+          <w:tcPr>
+            <w:tcW w:type="dxa" w:w="1728"/>
+            <w:vAlign w:val="center"/>
+            <w:shd w:fill="FAFCFD"/>
+            <w:tcMar>
+              <w:top w:w="55" w:type="dxa"/>
+              <w:bottom w:w="55" w:type="dxa"/>
+              <w:left w:w="70" w:type="dxa"/>
+              <w:right w:w="70" w:type="dxa"/>
+            </w:tcMar>
+          </w:tcPr>
+          <w:p>
+            <w:pPr>
+              <w:spacing w:line="276" w:lineRule="auto" w:before="0" w:after="0"/>
+            </w:pPr>
+            <w:r>
+              <w:rPr>
+                <w:rFonts w:ascii="Calibri" w:hAnsi="Calibri"/>
+                <w:color w:val="262626"/>
+                <w:sz w:val="16"/>
+              </w:rPr>
+              <w:t>Fig. S3a / S3b</w:t>
+            </w:r>
+          </w:p>
+        </w:tc>
+        <w:tc>
+          <w:tcPr>
+            <w:tcW w:type="dxa" w:w="1872"/>
+            <w:vAlign w:val="center"/>
+            <w:shd w:fill="FAFCFD"/>
+            <w:tcMar>
+              <w:top w:w="55" w:type="dxa"/>
+              <w:bottom w:w="55" w:type="dxa"/>
+              <w:left w:w="70" w:type="dxa"/>
+              <w:right w:w="70" w:type="dxa"/>
+            </w:tcMar>
+          </w:tcPr>
+          <w:p>
+            <w:pPr>
+              <w:spacing w:line="276" w:lineRule="auto" w:before="0" w:after="0"/>
+            </w:pPr>
+            <w:r>
+              <w:rPr>
+                <w:rFonts w:ascii="Calibri" w:hAnsi="Calibri"/>
+                <w:color w:val="262626"/>
+                <w:sz w:val="16"/>
+              </w:rPr>
+              <w:t>NES &gt; 1 UpSet &amp; Common-Dir</w:t>
+            </w:r>
+          </w:p>
+        </w:tc>
+        <w:tc>
+          <w:tcPr>
+            <w:tcW w:type="dxa" w:w="1872"/>
+            <w:vAlign w:val="center"/>
+            <w:shd w:fill="FAFCFD"/>
+            <w:tcMar>
+              <w:top w:w="55" w:type="dxa"/>
+              <w:bottom w:w="55" w:type="dxa"/>
+              <w:left w:w="70" w:type="dxa"/>
+              <w:right w:w="70" w:type="dxa"/>
+            </w:tcMar>
+          </w:tcPr>
+          <w:p>
+            <w:pPr>
+              <w:spacing w:line="276" w:lineRule="auto" w:before="0" w:after="0"/>
+            </w:pPr>
+            <w:r>
+              <w:rPr>
+                <w:rFonts w:ascii="Calibri" w:hAnsi="Calibri"/>
+                <w:color w:val="262626"/>
+                <w:sz w:val="16"/>
+              </w:rPr>
+              <w:t>NES &gt; 1 tissues (excl. Kidney)</w:t>
+            </w:r>
+          </w:p>
+        </w:tc>
+        <w:tc>
+          <w:tcPr>
+            <w:tcW w:type="dxa" w:w="2160"/>
+            <w:vAlign w:val="center"/>
+            <w:shd w:fill="FAFCFD"/>
+            <w:tcMar>
+              <w:top w:w="55" w:type="dxa"/>
+              <w:bottom w:w="55" w:type="dxa"/>
+              <w:left w:w="70" w:type="dxa"/>
+              <w:right w:w="70" w:type="dxa"/>
+            </w:tcMar>
+          </w:tcPr>
+          <w:p>
+            <w:pPr>
+              <w:spacing w:line="276" w:lineRule="auto" w:before="0" w:after="0"/>
+            </w:pPr>
+            <w:r>
+              <w:rPr>
+                <w:rFonts w:ascii="Calibri" w:hAnsi="Calibri"/>
+                <w:color w:val="262626"/>
+                <w:sz w:val="16"/>
+              </w:rPr>
+              <w:t>UpSet binary membership &amp; common-direction top 30</w:t>
             </w:r>
           </w:p>
         </w:tc>
@@ -2242,10 +3437,10 @@
             <w:vAlign w:val="center"/>
             <w:shd w:fill="FAFCFD"/>
             <w:tcMar>
-              <w:top w:w="60" w:type="dxa"/>
-              <w:bottom w:w="60" w:type="dxa"/>
-              <w:left w:w="80" w:type="dxa"/>
-              <w:right w:w="80" w:type="dxa"/>
+              <w:top w:w="55" w:type="dxa"/>
+              <w:bottom w:w="55" w:type="dxa"/>
+              <w:left w:w="70" w:type="dxa"/>
+              <w:right w:w="70" w:type="dxa"/>
             </w:tcMar>
           </w:tcPr>
           <w:p>
@@ -2270,10 +3465,10 @@
             <w:tcW w:type="dxa" w:w="1728"/>
             <w:vAlign w:val="center"/>
             <w:tcMar>
-              <w:top w:w="60" w:type="dxa"/>
-              <w:bottom w:w="60" w:type="dxa"/>
-              <w:left w:w="80" w:type="dxa"/>
-              <w:right w:w="80" w:type="dxa"/>
+              <w:top w:w="55" w:type="dxa"/>
+              <w:bottom w:w="55" w:type="dxa"/>
+              <w:left w:w="70" w:type="dxa"/>
+              <w:right w:w="70" w:type="dxa"/>
             </w:tcMar>
           </w:tcPr>
           <w:p>
@@ -2286,7 +3481,7 @@
                 <w:color w:val="262626"/>
                 <w:sz w:val="16"/>
               </w:rPr>
-              <w:t>Fig. S3b / S4b</w:t>
+              <w:t>Fig. S4a / S4b</w:t>
             </w:r>
           </w:p>
         </w:tc>
@@ -2295,10 +3490,10 @@
             <w:tcW w:type="dxa" w:w="1872"/>
             <w:vAlign w:val="center"/>
             <w:tcMar>
-              <w:top w:w="60" w:type="dxa"/>
-              <w:bottom w:w="60" w:type="dxa"/>
-              <w:left w:w="80" w:type="dxa"/>
-              <w:right w:w="80" w:type="dxa"/>
+              <w:top w:w="55" w:type="dxa"/>
+              <w:bottom w:w="55" w:type="dxa"/>
+              <w:left w:w="70" w:type="dxa"/>
+              <w:right w:w="70" w:type="dxa"/>
             </w:tcMar>
           </w:tcPr>
           <w:p>
@@ -2311,7 +3506,7 @@
                 <w:color w:val="262626"/>
                 <w:sz w:val="16"/>
               </w:rPr>
-              <w:t>Common-Direction DEGs</w:t>
+              <w:t>NES &lt; -1 UpSet &amp; Common-Dir</w:t>
             </w:r>
           </w:p>
         </w:tc>
@@ -2320,10 +3515,10 @@
             <w:tcW w:type="dxa" w:w="1872"/>
             <w:vAlign w:val="center"/>
             <w:tcMar>
-              <w:top w:w="60" w:type="dxa"/>
-              <w:bottom w:w="60" w:type="dxa"/>
-              <w:left w:w="80" w:type="dxa"/>
-              <w:right w:w="80" w:type="dxa"/>
+              <w:top w:w="55" w:type="dxa"/>
+              <w:bottom w:w="55" w:type="dxa"/>
+              <w:left w:w="70" w:type="dxa"/>
+              <w:right w:w="70" w:type="dxa"/>
             </w:tcMar>
           </w:tcPr>
           <w:p>
@@ -2336,7 +3531,7 @@
                 <w:color w:val="262626"/>
                 <w:sz w:val="16"/>
               </w:rPr>
-              <w:t>NES &gt; 1 / NES &lt; -1 multi-tissue sets</w:t>
+              <w:t>NES &lt; -1 tissues (excl. Lung/Thymus)</w:t>
             </w:r>
           </w:p>
         </w:tc>
@@ -2345,10 +3540,10 @@
             <w:tcW w:type="dxa" w:w="2160"/>
             <w:vAlign w:val="center"/>
             <w:tcMar>
-              <w:top w:w="60" w:type="dxa"/>
-              <w:bottom w:w="60" w:type="dxa"/>
-              <w:left w:w="80" w:type="dxa"/>
-              <w:right w:w="80" w:type="dxa"/>
+              <w:top w:w="55" w:type="dxa"/>
+              <w:bottom w:w="55" w:type="dxa"/>
+              <w:left w:w="70" w:type="dxa"/>
+              <w:right w:w="70" w:type="dxa"/>
             </w:tcMar>
           </w:tcPr>
           <w:p>
@@ -2361,7 +3556,7 @@
                 <w:color w:val="262626"/>
                 <w:sz w:val="16"/>
               </w:rPr>
-              <w:t>Directional concordance at P &lt; 0.10, ranked by min |log2FC|</w:t>
+              <w:t>UpSet binary membership &amp; common-direction top 30</w:t>
             </w:r>
           </w:p>
         </w:tc>
@@ -2370,10 +3565,10 @@
             <w:tcW w:type="dxa" w:w="1728"/>
             <w:vAlign w:val="center"/>
             <w:tcMar>
-              <w:top w:w="60" w:type="dxa"/>
-              <w:bottom w:w="60" w:type="dxa"/>
-              <w:left w:w="80" w:type="dxa"/>
-              <w:right w:w="80" w:type="dxa"/>
+              <w:top w:w="55" w:type="dxa"/>
+              <w:bottom w:w="55" w:type="dxa"/>
+              <w:left w:w="70" w:type="dxa"/>
+              <w:right w:w="70" w:type="dxa"/>
             </w:tcMar>
           </w:tcPr>
           <w:p>
@@ -2386,7 +3581,7 @@
                 <w:color w:val="262626"/>
                 <w:sz w:val="16"/>
               </w:rPr>
-              <w:t>python/plot_common_direction_heatmaps.py</w:t>
+              <w:t>R/figures/06_go_upsets.R</w:t>
             </w:r>
           </w:p>
         </w:tc>
@@ -2399,10 +3594,10 @@
             <w:vAlign w:val="center"/>
             <w:shd w:fill="FAFCFD"/>
             <w:tcMar>
-              <w:top w:w="60" w:type="dxa"/>
-              <w:bottom w:w="60" w:type="dxa"/>
-              <w:left w:w="80" w:type="dxa"/>
-              <w:right w:w="80" w:type="dxa"/>
+              <w:top w:w="55" w:type="dxa"/>
+              <w:bottom w:w="55" w:type="dxa"/>
+              <w:left w:w="70" w:type="dxa"/>
+              <w:right w:w="70" w:type="dxa"/>
             </w:tcMar>
           </w:tcPr>
           <w:p>
@@ -2425,10 +3620,10 @@
             <w:vAlign w:val="center"/>
             <w:shd w:fill="FAFCFD"/>
             <w:tcMar>
-              <w:top w:w="60" w:type="dxa"/>
-              <w:bottom w:w="60" w:type="dxa"/>
-              <w:left w:w="80" w:type="dxa"/>
-              <w:right w:w="80" w:type="dxa"/>
+              <w:top w:w="55" w:type="dxa"/>
+              <w:bottom w:w="55" w:type="dxa"/>
+              <w:left w:w="70" w:type="dxa"/>
+              <w:right w:w="70" w:type="dxa"/>
             </w:tcMar>
           </w:tcPr>
           <w:p>
@@ -2451,10 +3646,10 @@
             <w:vAlign w:val="center"/>
             <w:shd w:fill="FAFCFD"/>
             <w:tcMar>
-              <w:top w:w="60" w:type="dxa"/>
-              <w:bottom w:w="60" w:type="dxa"/>
-              <w:left w:w="80" w:type="dxa"/>
-              <w:right w:w="80" w:type="dxa"/>
+              <w:top w:w="55" w:type="dxa"/>
+              <w:bottom w:w="55" w:type="dxa"/>
+              <w:left w:w="70" w:type="dxa"/>
+              <w:right w:w="70" w:type="dxa"/>
             </w:tcMar>
           </w:tcPr>
           <w:p>
@@ -2477,10 +3672,10 @@
             <w:vAlign w:val="center"/>
             <w:shd w:fill="FAFCFD"/>
             <w:tcMar>
-              <w:top w:w="60" w:type="dxa"/>
-              <w:bottom w:w="60" w:type="dxa"/>
-              <w:left w:w="80" w:type="dxa"/>
-              <w:right w:w="80" w:type="dxa"/>
+              <w:top w:w="55" w:type="dxa"/>
+              <w:bottom w:w="55" w:type="dxa"/>
+              <w:left w:w="70" w:type="dxa"/>
+              <w:right w:w="70" w:type="dxa"/>
             </w:tcMar>
           </w:tcPr>
           <w:p>
@@ -2503,10 +3698,10 @@
             <w:vAlign w:val="center"/>
             <w:shd w:fill="FAFCFD"/>
             <w:tcMar>
-              <w:top w:w="60" w:type="dxa"/>
-              <w:bottom w:w="60" w:type="dxa"/>
-              <w:left w:w="80" w:type="dxa"/>
-              <w:right w:w="80" w:type="dxa"/>
+              <w:top w:w="55" w:type="dxa"/>
+              <w:bottom w:w="55" w:type="dxa"/>
+              <w:left w:w="70" w:type="dxa"/>
+              <w:right w:w="70" w:type="dxa"/>
             </w:tcMar>
           </w:tcPr>
           <w:p>
@@ -2531,10 +3726,10 @@
             <w:tcW w:type="dxa" w:w="1728"/>
             <w:vAlign w:val="center"/>
             <w:tcMar>
-              <w:top w:w="60" w:type="dxa"/>
-              <w:bottom w:w="60" w:type="dxa"/>
-              <w:left w:w="80" w:type="dxa"/>
-              <w:right w:w="80" w:type="dxa"/>
+              <w:top w:w="55" w:type="dxa"/>
+              <w:bottom w:w="55" w:type="dxa"/>
+              <w:left w:w="70" w:type="dxa"/>
+              <w:right w:w="70" w:type="dxa"/>
             </w:tcMar>
           </w:tcPr>
           <w:p>
@@ -2556,10 +3751,10 @@
             <w:tcW w:type="dxa" w:w="1872"/>
             <w:vAlign w:val="center"/>
             <w:tcMar>
-              <w:top w:w="60" w:type="dxa"/>
-              <w:bottom w:w="60" w:type="dxa"/>
-              <w:left w:w="80" w:type="dxa"/>
-              <w:right w:w="80" w:type="dxa"/>
+              <w:top w:w="55" w:type="dxa"/>
+              <w:bottom w:w="55" w:type="dxa"/>
+              <w:left w:w="70" w:type="dxa"/>
+              <w:right w:w="70" w:type="dxa"/>
             </w:tcMar>
           </w:tcPr>
           <w:p>
@@ -2581,10 +3776,10 @@
             <w:tcW w:type="dxa" w:w="1872"/>
             <w:vAlign w:val="center"/>
             <w:tcMar>
-              <w:top w:w="60" w:type="dxa"/>
-              <w:bottom w:w="60" w:type="dxa"/>
-              <w:left w:w="80" w:type="dxa"/>
-              <w:right w:w="80" w:type="dxa"/>
+              <w:top w:w="55" w:type="dxa"/>
+              <w:bottom w:w="55" w:type="dxa"/>
+              <w:left w:w="70" w:type="dxa"/>
+              <w:right w:w="70" w:type="dxa"/>
             </w:tcMar>
           </w:tcPr>
           <w:p>
@@ -2606,10 +3801,10 @@
             <w:tcW w:type="dxa" w:w="2160"/>
             <w:vAlign w:val="center"/>
             <w:tcMar>
-              <w:top w:w="60" w:type="dxa"/>
-              <w:bottom w:w="60" w:type="dxa"/>
-              <w:left w:w="80" w:type="dxa"/>
-              <w:right w:w="80" w:type="dxa"/>
+              <w:top w:w="55" w:type="dxa"/>
+              <w:bottom w:w="55" w:type="dxa"/>
+              <w:left w:w="70" w:type="dxa"/>
+              <w:right w:w="70" w:type="dxa"/>
             </w:tcMar>
           </w:tcPr>
           <w:p>
@@ -2631,10 +3826,10 @@
             <w:tcW w:type="dxa" w:w="1728"/>
             <w:vAlign w:val="center"/>
             <w:tcMar>
-              <w:top w:w="60" w:type="dxa"/>
-              <w:bottom w:w="60" w:type="dxa"/>
-              <w:left w:w="80" w:type="dxa"/>
-              <w:right w:w="80" w:type="dxa"/>
+              <w:top w:w="55" w:type="dxa"/>
+              <w:bottom w:w="55" w:type="dxa"/>
+              <w:left w:w="70" w:type="dxa"/>
+              <w:right w:w="70" w:type="dxa"/>
             </w:tcMar>
           </w:tcPr>
           <w:p>
@@ -2660,10 +3855,10 @@
             <w:vAlign w:val="center"/>
             <w:shd w:fill="FAFCFD"/>
             <w:tcMar>
-              <w:top w:w="60" w:type="dxa"/>
-              <w:bottom w:w="60" w:type="dxa"/>
-              <w:left w:w="80" w:type="dxa"/>
-              <w:right w:w="80" w:type="dxa"/>
+              <w:top w:w="55" w:type="dxa"/>
+              <w:bottom w:w="55" w:type="dxa"/>
+              <w:left w:w="70" w:type="dxa"/>
+              <w:right w:w="70" w:type="dxa"/>
             </w:tcMar>
           </w:tcPr>
           <w:p>
@@ -2676,7 +3871,7 @@
                 <w:color w:val="262626"/>
                 <w:sz w:val="16"/>
               </w:rPr>
-              <w:t>Fig_A-EJ~NHEJ (Linear)</w:t>
+              <w:t>Tables 01–04</w:t>
             </w:r>
           </w:p>
         </w:tc>
@@ -2686,141 +3881,10 @@
             <w:vAlign w:val="center"/>
             <w:shd w:fill="FAFCFD"/>
             <w:tcMar>
-              <w:top w:w="60" w:type="dxa"/>
-              <w:bottom w:w="60" w:type="dxa"/>
-              <w:left w:w="80" w:type="dxa"/>
-              <w:right w:w="80" w:type="dxa"/>
-            </w:tcMar>
-          </w:tcPr>
-          <w:p>
-            <w:pPr>
-              <w:spacing w:line="276" w:lineRule="auto" w:before="0" w:after="0"/>
-            </w:pPr>
-            <w:r>
-              <w:rPr>
-                <w:rFonts w:ascii="Calibri" w:hAnsi="Calibri"/>
-                <w:color w:val="262626"/>
-                <w:sz w:val="16"/>
-              </w:rPr>
-              <w:t>Linear Pathway Boxplots</w:t>
-            </w:r>
-          </w:p>
-        </w:tc>
-        <w:tc>
-          <w:tcPr>
-            <w:tcW w:type="dxa" w:w="1872"/>
-            <w:vAlign w:val="center"/>
-            <w:shd w:fill="FAFCFD"/>
-            <w:tcMar>
-              <w:top w:w="60" w:type="dxa"/>
-              <w:bottom w:w="60" w:type="dxa"/>
-              <w:left w:w="80" w:type="dxa"/>
-              <w:right w:w="80" w:type="dxa"/>
-            </w:tcMar>
-          </w:tcPr>
-          <w:p>
-            <w:pPr>
-              <w:spacing w:line="276" w:lineRule="auto" w:before="0" w:after="0"/>
-            </w:pPr>
-            <w:r>
-              <w:rPr>
-                <w:rFonts w:ascii="Calibri" w:hAnsi="Calibri"/>
-                <w:color w:val="262626"/>
-                <w:sz w:val="16"/>
-              </w:rPr>
-              <w:t>360 flight mice × 26 marker genes</w:t>
-            </w:r>
-          </w:p>
-        </w:tc>
-        <w:tc>
-          <w:tcPr>
-            <w:tcW w:type="dxa" w:w="2160"/>
-            <w:vAlign w:val="center"/>
-            <w:shd w:fill="FAFCFD"/>
-            <w:tcMar>
-              <w:top w:w="60" w:type="dxa"/>
-              <w:bottom w:w="60" w:type="dxa"/>
-              <w:left w:w="80" w:type="dxa"/>
-              <w:right w:w="80" w:type="dxa"/>
-            </w:tcMar>
-          </w:tcPr>
-          <w:p>
-            <w:pPr>
-              <w:spacing w:line="276" w:lineRule="auto" w:before="0" w:after="0"/>
-            </w:pPr>
-            <w:r>
-              <w:rPr>
-                <w:rFonts w:ascii="Calibri" w:hAnsi="Calibri"/>
-                <w:color w:val="262626"/>
-                <w:sz w:val="16"/>
-              </w:rPr>
-              <w:t>Linear expression 2^log2 - 1, Mean hinge, Gene &amp; Pathway ANOVA</w:t>
-            </w:r>
-          </w:p>
-        </w:tc>
-        <w:tc>
-          <w:tcPr>
-            <w:tcW w:type="dxa" w:w="1728"/>
-            <w:vAlign w:val="center"/>
-            <w:shd w:fill="FAFCFD"/>
-            <w:tcMar>
-              <w:top w:w="60" w:type="dxa"/>
-              <w:bottom w:w="60" w:type="dxa"/>
-              <w:left w:w="80" w:type="dxa"/>
-              <w:right w:w="80" w:type="dxa"/>
-            </w:tcMar>
-          </w:tcPr>
-          <w:p>
-            <w:pPr>
-              <w:spacing w:line="276" w:lineRule="auto" w:before="0" w:after="0"/>
-            </w:pPr>
-            <w:r>
-              <w:rPr>
-                <w:rFonts w:ascii="Calibri" w:hAnsi="Calibri"/>
-                <w:color w:val="262626"/>
-                <w:sz w:val="16"/>
-              </w:rPr>
-              <w:t>R/figures/10_pathway_gene_tissue_boxplots_linear.R</w:t>
-            </w:r>
-          </w:p>
-        </w:tc>
-      </w:tr>
-      <w:tr>
-        <w:trPr/>
-        <w:tc>
-          <w:tcPr>
-            <w:tcW w:type="dxa" w:w="1728"/>
-            <w:vAlign w:val="center"/>
-            <w:tcMar>
-              <w:top w:w="60" w:type="dxa"/>
-              <w:bottom w:w="60" w:type="dxa"/>
-              <w:left w:w="80" w:type="dxa"/>
-              <w:right w:w="80" w:type="dxa"/>
-            </w:tcMar>
-          </w:tcPr>
-          <w:p>
-            <w:pPr>
-              <w:spacing w:line="276" w:lineRule="auto" w:before="0" w:after="0"/>
-            </w:pPr>
-            <w:r>
-              <w:rPr>
-                <w:rFonts w:ascii="Calibri" w:hAnsi="Calibri"/>
-                <w:color w:val="262626"/>
-                <w:sz w:val="16"/>
-              </w:rPr>
-              <w:t>Tables 01–04 (Linear)</w:t>
-            </w:r>
-          </w:p>
-        </w:tc>
-        <w:tc>
-          <w:tcPr>
-            <w:tcW w:type="dxa" w:w="1872"/>
-            <w:vAlign w:val="center"/>
-            <w:tcMar>
-              <w:top w:w="60" w:type="dxa"/>
-              <w:bottom w:w="60" w:type="dxa"/>
-              <w:left w:w="80" w:type="dxa"/>
-              <w:right w:w="80" w:type="dxa"/>
+              <w:top w:w="55" w:type="dxa"/>
+              <w:bottom w:w="55" w:type="dxa"/>
+              <w:left w:w="70" w:type="dxa"/>
+              <w:right w:w="70" w:type="dxa"/>
             </w:tcMar>
           </w:tcPr>
           <w:p>
@@ -2841,11 +3905,12 @@
           <w:tcPr>
             <w:tcW w:type="dxa" w:w="1872"/>
             <w:vAlign w:val="center"/>
+            <w:shd w:fill="FAFCFD"/>
             <w:tcMar>
-              <w:top w:w="60" w:type="dxa"/>
-              <w:bottom w:w="60" w:type="dxa"/>
-              <w:left w:w="80" w:type="dxa"/>
-              <w:right w:w="80" w:type="dxa"/>
+              <w:top w:w="55" w:type="dxa"/>
+              <w:bottom w:w="55" w:type="dxa"/>
+              <w:left w:w="70" w:type="dxa"/>
+              <w:right w:w="70" w:type="dxa"/>
             </w:tcMar>
           </w:tcPr>
           <w:p>
@@ -2866,11 +3931,12 @@
           <w:tcPr>
             <w:tcW w:type="dxa" w:w="2160"/>
             <w:vAlign w:val="center"/>
+            <w:shd w:fill="FAFCFD"/>
             <w:tcMar>
-              <w:top w:w="60" w:type="dxa"/>
-              <w:bottom w:w="60" w:type="dxa"/>
-              <w:left w:w="80" w:type="dxa"/>
-              <w:right w:w="80" w:type="dxa"/>
+              <w:top w:w="55" w:type="dxa"/>
+              <w:bottom w:w="55" w:type="dxa"/>
+              <w:left w:w="70" w:type="dxa"/>
+              <w:right w:w="70" w:type="dxa"/>
             </w:tcMar>
           </w:tcPr>
           <w:p>
@@ -2891,11 +3957,12 @@
           <w:tcPr>
             <w:tcW w:type="dxa" w:w="1728"/>
             <w:vAlign w:val="center"/>
+            <w:shd w:fill="FAFCFD"/>
             <w:tcMar>
-              <w:top w:w="60" w:type="dxa"/>
-              <w:bottom w:w="60" w:type="dxa"/>
-              <w:left w:w="80" w:type="dxa"/>
-              <w:right w:w="80" w:type="dxa"/>
+              <w:top w:w="55" w:type="dxa"/>
+              <w:bottom w:w="55" w:type="dxa"/>
+              <w:left w:w="70" w:type="dxa"/>
+              <w:right w:w="70" w:type="dxa"/>
             </w:tcMar>
           </w:tcPr>
           <w:p>
@@ -2939,7 +4006,7 @@
         <w:color w:val="888888"/>
         <w:sz w:val="17"/>
       </w:rPr>
-      <w:t>Methods Section — NASA OSDR Multi-Tissue Spaceflight Dataset</w:t>
+      <w:t>Methods Section — NASA OSDR Multi-Tissue Spaceflight Dataset (Figure-Aligned)</w:t>
     </w:r>
   </w:p>
 </w:ftr>

</xml_diff>